<commit_message>
Cập nhật chuẩn hóa KHBD Tin học & Robotics Lớp 1-8, kịch bản tạo KHBD v2 và tài liệu chương trình
</commit_message>
<xml_diff>
--- a/KHBD_Tin_học/Lớp_6/Tuần_02/KHBD_Tin_hoc_Lớp_6_Tiet01_Bai_1_Thong_tin_va_du_lieu.docx
+++ b/KHBD_Tin_học/Lớp_6/Tuần_02/KHBD_Tin_hoc_Lớp_6_Tiet01_Bai_1_Thong_tin_va_du_lieu.docx
@@ -16,17 +16,23 @@
         </w:tblBorders>
       </w:tblPr>
       <w:tblGrid>
-        <w:gridCol w:w="4796"/>
-        <w:gridCol w:w="4796"/>
+        <w:gridCol w:w="4875"/>
+        <w:gridCol w:w="4875"/>
       </w:tblGrid>
       <w:tr>
         <w:tc>
           <w:tcPr>
-            <w:tcW w:type="dxa" w:w="4796"/>
+            <w:tcW w:type="dxa" w:w="4875"/>
+            <w:tcMar>
+              <w:top w:w="80" w:type="dxa"/>
+              <w:bottom w:w="80" w:type="dxa"/>
+              <w:left w:w="120" w:type="dxa"/>
+              <w:right w:w="120" w:type="dxa"/>
+            </w:tcMar>
           </w:tcPr>
           <w:p>
             <w:pPr>
-              <w:spacing w:line="276" w:lineRule="auto" w:after="40" w:before="0"/>
+              <w:spacing w:line="276" w:lineRule="auto" w:after="40"/>
               <w:jc w:val="left"/>
             </w:pPr>
             <w:r/>
@@ -37,28 +43,34 @@
                 <w:i w:val="0"/>
                 <w:sz w:val="26"/>
               </w:rPr>
-              <w:t>Trường: TH&amp;THCS UNIGO</w:t>
+              <w:t>Trường Tiểu học và THCS UNIGO</w:t>
             </w:r>
           </w:p>
         </w:tc>
         <w:tc>
           <w:tcPr>
-            <w:tcW w:type="dxa" w:w="4796"/>
+            <w:tcW w:type="dxa" w:w="4875"/>
+            <w:tcMar>
+              <w:top w:w="80" w:type="dxa"/>
+              <w:bottom w:w="80" w:type="dxa"/>
+              <w:left w:w="120" w:type="dxa"/>
+              <w:right w:w="120" w:type="dxa"/>
+            </w:tcMar>
           </w:tcPr>
           <w:p>
             <w:pPr>
-              <w:spacing w:line="276" w:lineRule="auto" w:after="40" w:before="0"/>
+              <w:spacing w:line="276" w:lineRule="auto" w:after="40"/>
               <w:jc w:val="left"/>
             </w:pPr>
             <w:r/>
             <w:r>
               <w:rPr>
                 <w:rFonts w:ascii="Times New Roman" w:hAnsi="Times New Roman" w:eastAsia="Times New Roman"/>
-                <w:b/>
-                <w:i w:val="0"/>
-                <w:sz w:val="26"/>
-              </w:rPr>
-              <w:t>Ngày soạn: 10/08/2026</w:t>
+                <w:b w:val="0"/>
+                <w:i w:val="0"/>
+                <w:sz w:val="26"/>
+              </w:rPr>
+              <w:t>Họ tên giáo viên: Đậu Đình Nguyên</w:t>
             </w:r>
           </w:p>
         </w:tc>
@@ -66,11 +78,17 @@
       <w:tr>
         <w:tc>
           <w:tcPr>
-            <w:tcW w:type="dxa" w:w="4796"/>
+            <w:tcW w:type="dxa" w:w="4875"/>
+            <w:tcMar>
+              <w:top w:w="80" w:type="dxa"/>
+              <w:bottom w:w="80" w:type="dxa"/>
+              <w:left w:w="120" w:type="dxa"/>
+              <w:right w:w="120" w:type="dxa"/>
+            </w:tcMar>
           </w:tcPr>
           <w:p>
             <w:pPr>
-              <w:spacing w:line="276" w:lineRule="auto" w:after="40" w:before="0"/>
+              <w:spacing w:line="276" w:lineRule="auto" w:after="40"/>
               <w:jc w:val="left"/>
             </w:pPr>
             <w:r/>
@@ -81,32 +99,23 @@
                 <w:i w:val="0"/>
                 <w:sz w:val="26"/>
               </w:rPr>
-              <w:t>GV: Đậu Đình Nguyên</w:t>
-            </w:r>
-          </w:p>
-          <w:p>
-            <w:pPr>
-              <w:spacing w:line="276" w:lineRule="auto" w:after="40" w:before="0"/>
-              <w:jc w:val="left"/>
-            </w:pPr>
-            <w:r>
-              <w:rPr>
-                <w:rFonts w:ascii="Times New Roman" w:hAnsi="Times New Roman" w:eastAsia="Times New Roman"/>
-                <w:b w:val="0"/>
-                <w:i w:val="0"/>
-                <w:sz w:val="26"/>
-              </w:rPr>
-              <w:t>Tổ: Tổ chuyên môn THCS</w:t>
+              <w:t>Tổ THCS</w:t>
             </w:r>
           </w:p>
         </w:tc>
         <w:tc>
           <w:tcPr>
-            <w:tcW w:type="dxa" w:w="4796"/>
+            <w:tcW w:type="dxa" w:w="4875"/>
+            <w:tcMar>
+              <w:top w:w="80" w:type="dxa"/>
+              <w:bottom w:w="80" w:type="dxa"/>
+              <w:left w:w="120" w:type="dxa"/>
+              <w:right w:w="120" w:type="dxa"/>
+            </w:tcMar>
           </w:tcPr>
           <w:p>
             <w:pPr>
-              <w:spacing w:line="276" w:lineRule="auto" w:after="40" w:before="0"/>
+              <w:spacing w:line="276" w:lineRule="auto" w:after="40"/>
               <w:jc w:val="left"/>
             </w:pPr>
             <w:r/>
@@ -117,22 +126,37 @@
                 <w:i w:val="0"/>
                 <w:sz w:val="26"/>
               </w:rPr>
-              <w:t>Ngày dạy: 12/08/2026</w:t>
-            </w:r>
-          </w:p>
-          <w:p>
-            <w:pPr>
-              <w:spacing w:line="276" w:lineRule="auto" w:after="40" w:before="0"/>
-              <w:jc w:val="left"/>
-            </w:pPr>
-            <w:r>
-              <w:rPr>
-                <w:rFonts w:ascii="Times New Roman" w:hAnsi="Times New Roman" w:eastAsia="Times New Roman"/>
-                <w:b w:val="0"/>
-                <w:i w:val="0"/>
-                <w:sz w:val="26"/>
-              </w:rPr>
-              <w:t>Lớp: Lớp 6</w:t>
+              <w:t>Ngày soạn: 08/08/2026</w:t>
+            </w:r>
+          </w:p>
+          <w:p>
+            <w:pPr>
+              <w:spacing w:line="276" w:lineRule="auto" w:after="40"/>
+              <w:jc w:val="left"/>
+            </w:pPr>
+            <w:r>
+              <w:rPr>
+                <w:rFonts w:ascii="Times New Roman" w:hAnsi="Times New Roman" w:eastAsia="Times New Roman"/>
+                <w:b w:val="0"/>
+                <w:i w:val="0"/>
+                <w:sz w:val="26"/>
+              </w:rPr>
+              <w:t>Ngày dạy: 14/08/2026</w:t>
+            </w:r>
+          </w:p>
+          <w:p>
+            <w:pPr>
+              <w:spacing w:line="276" w:lineRule="auto" w:after="40"/>
+              <w:jc w:val="left"/>
+            </w:pPr>
+            <w:r>
+              <w:rPr>
+                <w:rFonts w:ascii="Times New Roman" w:hAnsi="Times New Roman" w:eastAsia="Times New Roman"/>
+                <w:b w:val="0"/>
+                <w:i w:val="0"/>
+                <w:sz w:val="26"/>
+              </w:rPr>
+              <w:t>Lớp: 6A1</w:t>
             </w:r>
           </w:p>
         </w:tc>
@@ -163,8 +187,53 @@
     <w:p>
       <w:pPr>
         <w:spacing w:line="276" w:lineRule="auto" w:after="60" w:before="0"/>
+        <w:jc w:val="center"/>
+      </w:pPr>
+      <w:r>
+        <w:rPr>
+          <w:rFonts w:ascii="Times New Roman" w:hAnsi="Times New Roman" w:eastAsia="Times New Roman"/>
+          <w:b/>
+          <w:i/>
+          <w:sz w:val="26"/>
+        </w:rPr>
+        <w:t>Môn học: Tin học</w:t>
+      </w:r>
+    </w:p>
+    <w:p>
+      <w:pPr>
+        <w:spacing w:line="276" w:lineRule="auto" w:after="60" w:before="0"/>
+        <w:jc w:val="center"/>
+      </w:pPr>
+      <w:r>
+        <w:rPr>
+          <w:rFonts w:ascii="Times New Roman" w:hAnsi="Times New Roman" w:eastAsia="Times New Roman"/>
+          <w:b/>
+          <w:i/>
+          <w:sz w:val="26"/>
+        </w:rPr>
+        <w:t>Thời lượng: 1 tiết (45 phút)</w:t>
+      </w:r>
+    </w:p>
+    <w:p>
+      <w:pPr>
+        <w:spacing w:line="276" w:lineRule="auto" w:after="60" w:before="0"/>
+        <w:jc w:val="center"/>
+      </w:pPr>
+      <w:r>
+        <w:rPr>
+          <w:rFonts w:ascii="Times New Roman" w:hAnsi="Times New Roman" w:eastAsia="Times New Roman"/>
+          <w:b/>
+          <w:i w:val="0"/>
+          <w:sz w:val="26"/>
+        </w:rPr>
+        <w:t>Tiết theo PPCT: 1</w:t>
+      </w:r>
+    </w:p>
+    <w:p>
+      <w:pPr>
+        <w:spacing w:line="276" w:lineRule="auto" w:after="60" w:before="0"/>
         <w:ind w:firstLine="0"/>
-        <w:jc w:val="center"/>
+        <w:jc w:val="both"/>
       </w:pPr>
       <w:r>
         <w:rPr>
@@ -173,14 +242,14 @@
           <w:i w:val="0"/>
           <w:sz w:val="26"/>
         </w:rPr>
-        <w:t>Môn học: Tin học     Lớp: Lớp 6     Thời lượng: 1 tiết (45 phút)</w:t>
-      </w:r>
-    </w:p>
-    <w:p>
-      <w:pPr>
-        <w:spacing w:line="276" w:lineRule="auto" w:after="60" w:before="0"/>
-        <w:ind w:firstLine="0"/>
-        <w:jc w:val="center"/>
+        <w:t>I. Mục tiêu</w:t>
+      </w:r>
+    </w:p>
+    <w:p>
+      <w:pPr>
+        <w:spacing w:line="276" w:lineRule="auto" w:after="60" w:before="0"/>
+        <w:ind w:firstLine="284"/>
+        <w:jc w:val="both"/>
       </w:pPr>
       <w:r>
         <w:rPr>
@@ -189,14 +258,62 @@
           <w:i w:val="0"/>
           <w:sz w:val="26"/>
         </w:rPr>
-        <w:t>Tiết theo PPCT: 1</w:t>
-      </w:r>
-    </w:p>
-    <w:p>
-      <w:pPr>
-        <w:spacing w:line="276" w:lineRule="auto" w:after="60" w:before="0"/>
-        <w:ind w:firstLine="0"/>
-        <w:jc w:val="center"/>
+        <w:t>1. Kiến thức:</w:t>
+      </w:r>
+    </w:p>
+    <w:p>
+      <w:pPr>
+        <w:spacing w:line="276" w:lineRule="auto" w:after="60" w:before="0"/>
+        <w:ind w:firstLine="0" w:left="850"/>
+        <w:jc w:val="both"/>
+      </w:pPr>
+      <w:r>
+        <w:rPr>
+          <w:rFonts w:ascii="Times New Roman" w:hAnsi="Times New Roman" w:eastAsia="Times New Roman"/>
+          <w:b w:val="0"/>
+          <w:i w:val="0"/>
+          <w:sz w:val="26"/>
+        </w:rPr>
+        <w:t>- Sự khác nhau giữa thông tin và dữ liệu.</w:t>
+      </w:r>
+    </w:p>
+    <w:p>
+      <w:pPr>
+        <w:spacing w:line="276" w:lineRule="auto" w:after="60" w:before="0"/>
+        <w:ind w:firstLine="0" w:left="850"/>
+        <w:jc w:val="both"/>
+      </w:pPr>
+      <w:r>
+        <w:rPr>
+          <w:rFonts w:ascii="Times New Roman" w:hAnsi="Times New Roman" w:eastAsia="Times New Roman"/>
+          <w:b w:val="0"/>
+          <w:i w:val="0"/>
+          <w:sz w:val="26"/>
+        </w:rPr>
+        <w:t>- Thông tin và vật mang thông tin.</w:t>
+      </w:r>
+    </w:p>
+    <w:p>
+      <w:pPr>
+        <w:spacing w:line="276" w:lineRule="auto" w:after="60" w:before="0"/>
+        <w:ind w:firstLine="0" w:left="850"/>
+        <w:jc w:val="both"/>
+      </w:pPr>
+      <w:r>
+        <w:rPr>
+          <w:rFonts w:ascii="Times New Roman" w:hAnsi="Times New Roman" w:eastAsia="Times New Roman"/>
+          <w:b w:val="0"/>
+          <w:i w:val="0"/>
+          <w:sz w:val="26"/>
+        </w:rPr>
+        <w:t>- Ví dụ minh họa tầm quan trọng của thông tin và ví dụ giữa thông tin và dữ liệu.</w:t>
+      </w:r>
+    </w:p>
+    <w:p>
+      <w:pPr>
+        <w:spacing w:line="276" w:lineRule="auto" w:after="60" w:before="0"/>
+        <w:ind w:firstLine="284"/>
+        <w:jc w:val="both"/>
       </w:pPr>
       <w:r>
         <w:rPr>
@@ -205,13 +322,13 @@
           <w:i w:val="0"/>
           <w:sz w:val="26"/>
         </w:rPr>
-        <w:t>Tên tiết: Bài 1. Thông tin và dữ liệu</w:t>
-      </w:r>
-    </w:p>
-    <w:p>
-      <w:pPr>
-        <w:spacing w:line="276" w:lineRule="auto" w:after="60" w:before="0"/>
-        <w:ind w:firstLine="0"/>
+        <w:t>2. Năng lực:</w:t>
+      </w:r>
+    </w:p>
+    <w:p>
+      <w:pPr>
+        <w:spacing w:line="276" w:lineRule="auto" w:after="60" w:before="0"/>
+        <w:ind w:firstLine="567"/>
         <w:jc w:val="both"/>
       </w:pPr>
       <w:r>
@@ -221,7 +338,151 @@
           <w:i w:val="0"/>
           <w:sz w:val="26"/>
         </w:rPr>
-        <w:t>I. Mục tiêu</w:t>
+        <w:t>2.1. Năng lực đặc thù (Tin học):</w:t>
+      </w:r>
+    </w:p>
+    <w:p>
+      <w:pPr>
+        <w:spacing w:line="276" w:lineRule="auto" w:after="60" w:before="0"/>
+        <w:ind w:firstLine="0" w:left="850"/>
+        <w:jc w:val="both"/>
+      </w:pPr>
+      <w:r>
+        <w:rPr>
+          <w:rFonts w:ascii="Times New Roman" w:hAnsi="Times New Roman" w:eastAsia="Times New Roman"/>
+          <w:b w:val="0"/>
+          <w:i w:val="0"/>
+          <w:sz w:val="26"/>
+        </w:rPr>
+        <w:t>- NLa (Sử dụng và quản lí các phương tiện ICT): Thao tác đúng quy trình các công cụ, phần mềm trong bài Bài 1. Thông tin và dữ liệu. (Đạt được thông qua Hoạt động 2)</w:t>
+      </w:r>
+    </w:p>
+    <w:p>
+      <w:pPr>
+        <w:spacing w:line="276" w:lineRule="auto" w:after="60" w:before="0"/>
+        <w:ind w:firstLine="0" w:left="850"/>
+        <w:jc w:val="both"/>
+      </w:pPr>
+      <w:r>
+        <w:rPr>
+          <w:rFonts w:ascii="Times New Roman" w:hAnsi="Times New Roman" w:eastAsia="Times New Roman"/>
+          <w:b w:val="0"/>
+          <w:i w:val="0"/>
+          <w:sz w:val="26"/>
+        </w:rPr>
+        <w:t>- NLc (Giải quyết vấn đề với sự hỗ trợ của ICT): Hoàn thành nhiệm vụ thực hành và xử lý tình huống thực tế. (Đạt được thông qua Hoạt động 3)</w:t>
+      </w:r>
+    </w:p>
+    <w:p>
+      <w:pPr>
+        <w:spacing w:line="276" w:lineRule="auto" w:after="60" w:before="0"/>
+        <w:ind w:firstLine="567"/>
+        <w:jc w:val="both"/>
+      </w:pPr>
+      <w:r>
+        <w:rPr>
+          <w:rFonts w:ascii="Times New Roman" w:hAnsi="Times New Roman" w:eastAsia="Times New Roman"/>
+          <w:b/>
+          <w:i w:val="0"/>
+          <w:sz w:val="26"/>
+        </w:rPr>
+        <w:t>2.2. Năng lực số (Thông tư 02/2025 – CV 3456):</w:t>
+      </w:r>
+    </w:p>
+    <w:p>
+      <w:pPr>
+        <w:spacing w:line="276" w:lineRule="auto" w:after="60" w:before="0"/>
+        <w:ind w:firstLine="0" w:left="850"/>
+        <w:jc w:val="both"/>
+      </w:pPr>
+      <w:r>
+        <w:rPr>
+          <w:rFonts w:ascii="Times New Roman" w:hAnsi="Times New Roman" w:eastAsia="Times New Roman"/>
+          <w:b w:val="0"/>
+          <w:i w:val="0"/>
+          <w:sz w:val="26"/>
+        </w:rPr>
+        <w:t>- Miền I. Khai thác dữ liệu và thông tin (thành tố 1.1. Duyệt, tìm kiếm và lọc dữ liệu, thông tin và nội dung số – Bậc 3): Khai thác thông tin số phục vụ bài học. (Đạt được thông qua Hoạt động 2)</w:t>
+      </w:r>
+    </w:p>
+    <w:p>
+      <w:pPr>
+        <w:spacing w:line="276" w:lineRule="auto" w:after="60" w:before="0"/>
+        <w:ind w:firstLine="0" w:left="850"/>
+        <w:jc w:val="both"/>
+      </w:pPr>
+      <w:r>
+        <w:rPr>
+          <w:rFonts w:ascii="Times New Roman" w:hAnsi="Times New Roman" w:eastAsia="Times New Roman"/>
+          <w:b w:val="0"/>
+          <w:i w:val="0"/>
+          <w:sz w:val="26"/>
+        </w:rPr>
+        <w:t>- Miền IV. An toàn (thành tố 4.1. Bảo vệ thiết bị và nội dung số – Bậc 3): Tuân thủ quy tắc an toàn thiết bị và bảo vệ dữ liệu. (Đạt được thông qua Hoạt động 3, Hoạt động 4)</w:t>
+      </w:r>
+    </w:p>
+    <w:p>
+      <w:pPr>
+        <w:spacing w:line="276" w:lineRule="auto" w:after="60" w:before="0"/>
+        <w:ind w:firstLine="567"/>
+        <w:jc w:val="both"/>
+      </w:pPr>
+      <w:r>
+        <w:rPr>
+          <w:rFonts w:ascii="Times New Roman" w:hAnsi="Times New Roman" w:eastAsia="Times New Roman"/>
+          <w:b/>
+          <w:i w:val="0"/>
+          <w:sz w:val="26"/>
+        </w:rPr>
+        <w:t>2.3. Năng lực chung:</w:t>
+      </w:r>
+    </w:p>
+    <w:p>
+      <w:pPr>
+        <w:spacing w:line="276" w:lineRule="auto" w:after="60" w:before="0"/>
+        <w:ind w:firstLine="0" w:left="850"/>
+        <w:jc w:val="both"/>
+      </w:pPr>
+      <w:r>
+        <w:rPr>
+          <w:rFonts w:ascii="Times New Roman" w:hAnsi="Times New Roman" w:eastAsia="Times New Roman"/>
+          <w:b w:val="0"/>
+          <w:i w:val="0"/>
+          <w:sz w:val="26"/>
+        </w:rPr>
+        <w:t>- Tự chủ và tự học: Chủ động đọc tài liệu SGK, quan sát thao tác mẫu và tự thực hiện nhiệm vụ học tập. (Đạt được thông qua Hoạt động 1, Hoạt động 2)</w:t>
+      </w:r>
+    </w:p>
+    <w:p>
+      <w:pPr>
+        <w:spacing w:line="276" w:lineRule="auto" w:after="60" w:before="0"/>
+        <w:ind w:firstLine="0" w:left="850"/>
+        <w:jc w:val="both"/>
+      </w:pPr>
+      <w:r>
+        <w:rPr>
+          <w:rFonts w:ascii="Times New Roman" w:hAnsi="Times New Roman" w:eastAsia="Times New Roman"/>
+          <w:b w:val="0"/>
+          <w:i w:val="0"/>
+          <w:sz w:val="26"/>
+        </w:rPr>
+        <w:t>- Giao tiếp và hợp tác: Thảo luận nhóm hiệu quả, chia sẻ và hỗ trợ bạn trong giờ thực hành. (Đạt được thông qua Hoạt động 2, Hoạt động 3)</w:t>
+      </w:r>
+    </w:p>
+    <w:p>
+      <w:pPr>
+        <w:spacing w:line="276" w:lineRule="auto" w:after="60" w:before="0"/>
+        <w:ind w:firstLine="0" w:left="850"/>
+        <w:jc w:val="both"/>
+      </w:pPr>
+      <w:r>
+        <w:rPr>
+          <w:rFonts w:ascii="Times New Roman" w:hAnsi="Times New Roman" w:eastAsia="Times New Roman"/>
+          <w:b w:val="0"/>
+          <w:i w:val="0"/>
+          <w:sz w:val="26"/>
+        </w:rPr>
+        <w:t>- Giải quyết vấn đề và sáng tạo: Phát hiện và sửa lỗi trong quá trình thực hành, đề xuất ý tưởng ứng dụng mới. (Đạt được thông qua Hoạt động 4)</w:t>
       </w:r>
     </w:p>
     <w:p>
@@ -237,7 +498,7 @@
           <w:i w:val="0"/>
           <w:sz w:val="26"/>
         </w:rPr>
-        <w:t>1. Kiến thức:</w:t>
+        <w:t>3. Phẩm chất:</w:t>
       </w:r>
     </w:p>
     <w:p>
@@ -253,7 +514,7 @@
           <w:i w:val="0"/>
           <w:sz w:val="26"/>
         </w:rPr>
-        <w:t>- Sự hiểu biết về nội dung: Nhận biết được sự khác nhau giữa thông tin và dữ liệu.  - Phân biệt được thông tin và vật mang thông tin.  - Nêu được ví dụ minh họa tầm quan trọng của thông tin và ví dụ giữa thông tin và dữ liệu..</w:t>
+        <w:t>- Chăm chỉ: Tích cực tham gia hoạt động tìm hiểu và hoàn thành bài tập thực hành. (Thông qua Hoạt động 1, Hoạt động 2)</w:t>
       </w:r>
     </w:p>
     <w:p>
@@ -269,39 +530,7 @@
           <w:i w:val="0"/>
           <w:sz w:val="26"/>
         </w:rPr>
-        <w:t>- Khả năng nhận diện và vận dụng kiến thức bài học để thực hành thao tác trên máy tính/thiết bị số.</w:t>
-      </w:r>
-    </w:p>
-    <w:p>
-      <w:pPr>
-        <w:spacing w:line="276" w:lineRule="auto" w:after="60" w:before="0"/>
-        <w:ind w:firstLine="284"/>
-        <w:jc w:val="both"/>
-      </w:pPr>
-      <w:r>
-        <w:rPr>
-          <w:rFonts w:ascii="Times New Roman" w:hAnsi="Times New Roman" w:eastAsia="Times New Roman"/>
-          <w:b/>
-          <w:i w:val="0"/>
-          <w:sz w:val="26"/>
-        </w:rPr>
-        <w:t>2. Năng lực:</w:t>
-      </w:r>
-    </w:p>
-    <w:p>
-      <w:pPr>
-        <w:spacing w:line="276" w:lineRule="auto" w:after="60" w:before="0"/>
-        <w:ind w:firstLine="567"/>
-        <w:jc w:val="both"/>
-      </w:pPr>
-      <w:r>
-        <w:rPr>
-          <w:rFonts w:ascii="Times New Roman" w:hAnsi="Times New Roman" w:eastAsia="Times New Roman"/>
-          <w:b/>
-          <w:i w:val="0"/>
-          <w:sz w:val="26"/>
-        </w:rPr>
-        <w:t>2.1. Năng lực đặc thù (Tin học):</w:t>
+        <w:t>- Trung thực: Đánh giá đúng kết quả học tập, tôn trọng sản phẩm của người khác. (Thông qua Hoạt động 3)</w:t>
       </w:r>
     </w:p>
     <w:p>
@@ -317,199 +546,7 @@
           <w:i w:val="0"/>
           <w:sz w:val="26"/>
         </w:rPr>
-        <w:t>- NLa (Sử dụng và quản lí các phương tiện ICT): Nhận diện, phân tích và thao tác đúng quy trình các công cụ, phần mềm trong bài Bài 1. Thông tin và dữ liệu. (Đạt được thông qua Hoạt động 2)</w:t>
-      </w:r>
-    </w:p>
-    <w:p>
-      <w:pPr>
-        <w:spacing w:line="276" w:lineRule="auto" w:after="60" w:before="0"/>
-        <w:ind w:firstLine="0" w:left="850"/>
-        <w:jc w:val="both"/>
-      </w:pPr>
-      <w:r>
-        <w:rPr>
-          <w:rFonts w:ascii="Times New Roman" w:hAnsi="Times New Roman" w:eastAsia="Times New Roman"/>
-          <w:b w:val="0"/>
-          <w:i w:val="0"/>
-          <w:sz w:val="26"/>
-        </w:rPr>
-        <w:t>- NLc (Giải quyết vấn đề với sự hỗ trợ của ICT): Vận dụng kiến thức, kỹ năng đã học để hoàn thành nhiệm vụ thực hành và xử lý tình huống thực tế. (Đạt được thông qua Hoạt động 3)</w:t>
-      </w:r>
-    </w:p>
-    <w:p>
-      <w:pPr>
-        <w:spacing w:line="276" w:lineRule="auto" w:after="60" w:before="0"/>
-        <w:ind w:firstLine="567"/>
-        <w:jc w:val="both"/>
-      </w:pPr>
-      <w:r>
-        <w:rPr>
-          <w:rFonts w:ascii="Times New Roman" w:hAnsi="Times New Roman" w:eastAsia="Times New Roman"/>
-          <w:b/>
-          <w:i w:val="0"/>
-          <w:sz w:val="26"/>
-        </w:rPr>
-        <w:t>2.2. Năng lực số (Thông tư 02/2025 – CV 3456):</w:t>
-      </w:r>
-    </w:p>
-    <w:p>
-      <w:pPr>
-        <w:spacing w:line="276" w:lineRule="auto" w:after="60" w:before="0"/>
-        <w:ind w:firstLine="0" w:left="850"/>
-        <w:jc w:val="both"/>
-      </w:pPr>
-      <w:r>
-        <w:rPr>
-          <w:rFonts w:ascii="Times New Roman" w:hAnsi="Times New Roman" w:eastAsia="Times New Roman" w:cs="Times New Roman"/>
-          <w:b w:val="0"/>
-          <w:i w:val="0"/>
-          <w:sz w:val="26"/>
-        </w:rPr>
-        <w:t>- Miền I. Khai thác dữ liệu và thông tin (thành tố 1.1. Duyệt, tìm kiếm và lọc dữ liệu, thông tin và nội dung số – Bậc 3): Giải thích được nhu cầu thông tin,; Thực hiện được rõ ràng và theo quy trình các tìm kiếm để tìm dữ liệu, thông tin và nội dung trong môi trường số,. (Đạt được thông qua Hoạt động 2, Hoạt động 3).</w:t>
-      </w:r>
-    </w:p>
-    <w:p>
-      <w:pPr>
-        <w:spacing w:line="276" w:lineRule="auto" w:after="60" w:before="0"/>
-        <w:ind w:firstLine="0" w:left="850"/>
-        <w:jc w:val="both"/>
-      </w:pPr>
-      <w:r>
-        <w:rPr>
-          <w:rFonts w:ascii="Times New Roman" w:hAnsi="Times New Roman" w:eastAsia="Times New Roman" w:cs="Times New Roman"/>
-          <w:b w:val="0"/>
-          <w:i w:val="0"/>
-          <w:sz w:val="26"/>
-        </w:rPr>
-        <w:t>- Miền I. Khai thác dữ liệu và thông tin (thành tố 1.2. Đánh giá dữ liệu, thông tin và nội dung số – Bậc 3): Thực hiện phân tích, so sánh, đánh giá được độ tin cậy và độ chính xác của các nguồn dữ liệu, thông tin và nội dung số đã được tổ chức rõ ràng; Thực hiện phân tích, diễn giải và đánh giá được dữ liệu, thông tin và nội dung số được xác định rõ ràng. (Đạt được thông qua Hoạt động 2, Hoạt động 4).</w:t>
-      </w:r>
-    </w:p>
-    <w:p>
-      <w:pPr>
-        <w:spacing w:line="276" w:lineRule="auto" w:after="60" w:before="0"/>
-        <w:ind w:firstLine="567"/>
-        <w:jc w:val="both"/>
-      </w:pPr>
-      <w:r>
-        <w:rPr>
-          <w:rFonts w:ascii="Times New Roman" w:hAnsi="Times New Roman" w:eastAsia="Times New Roman"/>
-          <w:b/>
-          <w:i w:val="0"/>
-          <w:sz w:val="26"/>
-        </w:rPr>
-        <w:t>2.3. Năng lực chung:</w:t>
-      </w:r>
-    </w:p>
-    <w:p>
-      <w:pPr>
-        <w:spacing w:line="276" w:lineRule="auto" w:after="60" w:before="0"/>
-        <w:ind w:firstLine="0" w:left="850"/>
-        <w:jc w:val="both"/>
-      </w:pPr>
-      <w:r>
-        <w:rPr>
-          <w:rFonts w:ascii="Times New Roman" w:hAnsi="Times New Roman" w:eastAsia="Times New Roman"/>
-          <w:b w:val="0"/>
-          <w:i w:val="0"/>
-          <w:sz w:val="26"/>
-        </w:rPr>
-        <w:t>- Tự chủ và tự học: Chủ động đọc tài liệu SGK, quan sát thao tác mẫu và tự thực hiện nhiệm vụ học tập. (Đạt được thông qua Hoạt động 1, Hoạt động 2)</w:t>
-      </w:r>
-    </w:p>
-    <w:p>
-      <w:pPr>
-        <w:spacing w:line="276" w:lineRule="auto" w:after="60" w:before="0"/>
-        <w:ind w:firstLine="0" w:left="850"/>
-        <w:jc w:val="both"/>
-      </w:pPr>
-      <w:r>
-        <w:rPr>
-          <w:rFonts w:ascii="Times New Roman" w:hAnsi="Times New Roman" w:eastAsia="Times New Roman"/>
-          <w:b w:val="0"/>
-          <w:i w:val="0"/>
-          <w:sz w:val="26"/>
-        </w:rPr>
-        <w:t>- Giao tiếp và hợp tác: Thảo luận nhóm hiệu quả, chia sẻ và hỗ trợ bạn trong giờ thực hành máy tính. (Đạt được thông qua Hoạt động 2, Hoạt động 3)</w:t>
-      </w:r>
-    </w:p>
-    <w:p>
-      <w:pPr>
-        <w:spacing w:line="276" w:lineRule="auto" w:after="60" w:before="0"/>
-        <w:ind w:firstLine="0" w:left="850"/>
-        <w:jc w:val="both"/>
-      </w:pPr>
-      <w:r>
-        <w:rPr>
-          <w:rFonts w:ascii="Times New Roman" w:hAnsi="Times New Roman" w:eastAsia="Times New Roman"/>
-          <w:b w:val="0"/>
-          <w:i w:val="0"/>
-          <w:sz w:val="26"/>
-        </w:rPr>
-        <w:t>- Giải quyết vấn đề và sáng tạo: Phát hiện và sửa lỗi trong quá trình thực hành, đề xuất ý tưởng ứng dụng mới. (Đạt được thông qua Hoạt động 4)</w:t>
-      </w:r>
-    </w:p>
-    <w:p>
-      <w:pPr>
-        <w:spacing w:line="276" w:lineRule="auto" w:after="60" w:before="0"/>
-        <w:ind w:firstLine="284"/>
-        <w:jc w:val="both"/>
-      </w:pPr>
-      <w:r>
-        <w:rPr>
-          <w:rFonts w:ascii="Times New Roman" w:hAnsi="Times New Roman" w:eastAsia="Times New Roman"/>
-          <w:b/>
-          <w:i w:val="0"/>
-          <w:sz w:val="26"/>
-        </w:rPr>
-        <w:t>3. Phẩm chất:</w:t>
-      </w:r>
-    </w:p>
-    <w:p>
-      <w:pPr>
-        <w:spacing w:line="276" w:lineRule="auto" w:after="60" w:before="0"/>
-        <w:ind w:firstLine="0" w:left="850"/>
-        <w:jc w:val="both"/>
-      </w:pPr>
-      <w:r>
-        <w:rPr>
-          <w:rFonts w:ascii="Times New Roman" w:hAnsi="Times New Roman" w:eastAsia="Times New Roman"/>
-          <w:b w:val="0"/>
-          <w:i w:val="0"/>
-          <w:sz w:val="26"/>
-        </w:rPr>
-        <w:t>- Chăm chỉ: Tích cực tham gia các hoạt động tìm hiểu bài học, hăng hái phát biểu và hoàn thành bài tập thực hành. (Thông qua Hoạt động 1, Hoạt động 2)</w:t>
-      </w:r>
-    </w:p>
-    <w:p>
-      <w:pPr>
-        <w:spacing w:line="276" w:lineRule="auto" w:after="60" w:before="0"/>
-        <w:ind w:firstLine="0" w:left="850"/>
-        <w:jc w:val="both"/>
-      </w:pPr>
-      <w:r>
-        <w:rPr>
-          <w:rFonts w:ascii="Times New Roman" w:hAnsi="Times New Roman" w:eastAsia="Times New Roman"/>
-          <w:b w:val="0"/>
-          <w:i w:val="0"/>
-          <w:sz w:val="26"/>
-        </w:rPr>
-        <w:t>- Trung thực: Đánh giá đúng kết quả học tập của bản thân và bạn bè, tôn trọng sản phẩm số của người khác. (Thông qua Hoạt động 3)</w:t>
-      </w:r>
-    </w:p>
-    <w:p>
-      <w:pPr>
-        <w:spacing w:line="276" w:lineRule="auto" w:after="60" w:before="0"/>
-        <w:ind w:firstLine="0" w:left="850"/>
-        <w:jc w:val="both"/>
-      </w:pPr>
-      <w:r>
-        <w:rPr>
-          <w:rFonts w:ascii="Times New Roman" w:hAnsi="Times New Roman" w:eastAsia="Times New Roman"/>
-          <w:b w:val="0"/>
-          <w:i w:val="0"/>
-          <w:sz w:val="26"/>
-        </w:rPr>
-        <w:t>- Trách nhiệm: Giữ gìn an toàn thiết bị phòng máy, có ý thức bảo vệ tài sản công cộng và dữ liệu số. (Thông qua Hoạt động 3, Hoạt động 4)</w:t>
+        <w:t>- Trách nhiệm: Giữ gìn an toàn thiết bị, bảo vệ tài sản công cộng và dữ liệu số. (Thông qua Hoạt động 3, Hoạt động 4)</w:t>
       </w:r>
     </w:p>
     <w:p>
@@ -678,7 +715,7 @@
           <w:i/>
           <w:sz w:val="26"/>
         </w:rPr>
-        <w:t>Kích hoạt hiểu biết nền, tạo hứng thú và kết nối học sinh vào bài học Bài 1. Thông tin và dữ liệu.</w:t>
+        <w:t>Kích hoạt hiểu biết nền, tạo hứng thú và kết nối HS vào bài học Bài 1. Thông tin và dữ liệu.</w:t>
       </w:r>
     </w:p>
     <w:p>
@@ -728,7 +765,7 @@
           <w:i/>
           <w:sz w:val="26"/>
         </w:rPr>
-        <w:t>HS đưa ra câu trả lời ban đầu, xác định được nhiệm vụ trọng tâm cần tìm hiểu.</w:t>
+        <w:t>HS đưa ra câu trả lời ban đầu, xác định được nhiệm vụ trọng tâm.</w:t>
       </w:r>
     </w:p>
     <w:p>
@@ -761,18 +798,23 @@
         </w:tblBorders>
       </w:tblPr>
       <w:tblGrid>
-        <w:gridCol w:w="3198"/>
-        <w:gridCol w:w="3198"/>
-        <w:gridCol w:w="3198"/>
+        <w:gridCol w:w="4875"/>
+        <w:gridCol w:w="4875"/>
       </w:tblGrid>
       <w:tr>
         <w:tc>
           <w:tcPr>
-            <w:tcW w:type="dxa" w:w="1814"/>
+            <w:tcW w:type="dxa" w:w="5102"/>
+            <w:tcMar>
+              <w:top w:w="80" w:type="dxa"/>
+              <w:bottom w:w="80" w:type="dxa"/>
+              <w:left w:w="120" w:type="dxa"/>
+              <w:right w:w="120" w:type="dxa"/>
+            </w:tcMar>
           </w:tcPr>
           <w:p>
             <w:pPr>
-              <w:spacing w:line="276" w:lineRule="auto" w:after="40" w:before="0"/>
+              <w:spacing w:line="276" w:lineRule="auto" w:after="40"/>
               <w:jc w:val="center"/>
             </w:pPr>
             <w:r/>
@@ -783,17 +825,23 @@
                 <w:i w:val="0"/>
                 <w:sz w:val="26"/>
               </w:rPr>
-              <w:t>Bước</w:t>
+              <w:t>HOẠT ĐỘNG CỦA GV – HS</w:t>
             </w:r>
           </w:p>
         </w:tc>
         <w:tc>
           <w:tcPr>
-            <w:tcW w:type="dxa" w:w="3628"/>
+            <w:tcW w:type="dxa" w:w="3969"/>
+            <w:tcMar>
+              <w:top w:w="80" w:type="dxa"/>
+              <w:bottom w:w="80" w:type="dxa"/>
+              <w:left w:w="120" w:type="dxa"/>
+              <w:right w:w="120" w:type="dxa"/>
+            </w:tcMar>
           </w:tcPr>
           <w:p>
             <w:pPr>
-              <w:spacing w:line="276" w:lineRule="auto" w:after="40" w:before="0"/>
+              <w:spacing w:line="276" w:lineRule="auto" w:after="40"/>
               <w:jc w:val="center"/>
             </w:pPr>
             <w:r/>
@@ -804,28 +852,7 @@
                 <w:i w:val="0"/>
                 <w:sz w:val="26"/>
               </w:rPr>
-              <w:t>Hoạt động của GV</w:t>
-            </w:r>
-          </w:p>
-        </w:tc>
-        <w:tc>
-          <w:tcPr>
-            <w:tcW w:type="dxa" w:w="3628"/>
-          </w:tcPr>
-          <w:p>
-            <w:pPr>
-              <w:spacing w:line="276" w:lineRule="auto" w:after="40" w:before="0"/>
-              <w:jc w:val="center"/>
-            </w:pPr>
-            <w:r/>
-            <w:r>
-              <w:rPr>
-                <w:rFonts w:ascii="Times New Roman" w:hAnsi="Times New Roman" w:eastAsia="Times New Roman"/>
-                <w:b/>
-                <w:i w:val="0"/>
-                <w:sz w:val="26"/>
-              </w:rPr>
-              <w:t>Hoạt động của HS</w:t>
+              <w:t>KẾT QUẢ CẦN ĐẠT</w:t>
             </w:r>
           </w:p>
         </w:tc>
@@ -833,62 +860,194 @@
       <w:tr>
         <w:tc>
           <w:tcPr>
-            <w:tcW w:type="dxa" w:w="1814"/>
+            <w:tcW w:type="dxa" w:w="4875"/>
+            <w:tcMar>
+              <w:top w:w="80" w:type="dxa"/>
+              <w:bottom w:w="80" w:type="dxa"/>
+              <w:left w:w="120" w:type="dxa"/>
+              <w:right w:w="120" w:type="dxa"/>
+            </w:tcMar>
           </w:tcPr>
           <w:p>
             <w:pPr>
-              <w:spacing w:line="276" w:lineRule="auto" w:after="40" w:before="0"/>
-              <w:jc w:val="center"/>
+              <w:spacing w:line="276" w:lineRule="auto" w:after="40"/>
+              <w:jc w:val="left"/>
             </w:pPr>
             <w:r/>
             <w:r>
               <w:rPr>
                 <w:rFonts w:ascii="Times New Roman" w:hAnsi="Times New Roman" w:eastAsia="Times New Roman"/>
-                <w:b/>
-                <w:i/>
-                <w:sz w:val="26"/>
-              </w:rPr>
-              <w:t>Bước 1:</w:t>
-            </w:r>
-          </w:p>
-          <w:p>
-            <w:pPr>
-              <w:spacing w:line="276" w:lineRule="auto" w:after="40" w:before="0"/>
-              <w:jc w:val="center"/>
-            </w:pPr>
-            <w:r>
-              <w:rPr>
-                <w:rFonts w:ascii="Times New Roman" w:hAnsi="Times New Roman" w:eastAsia="Times New Roman"/>
-                <w:b/>
-                <w:i/>
-                <w:sz w:val="26"/>
-              </w:rPr>
-              <w:t>Chuyển giao</w:t>
-            </w:r>
-          </w:p>
-          <w:p>
-            <w:pPr>
-              <w:spacing w:line="276" w:lineRule="auto" w:after="40" w:before="0"/>
-              <w:jc w:val="center"/>
-            </w:pPr>
-            <w:r>
-              <w:rPr>
-                <w:rFonts w:ascii="Times New Roman" w:hAnsi="Times New Roman" w:eastAsia="Times New Roman"/>
-                <w:b/>
-                <w:i/>
-                <w:sz w:val="26"/>
-              </w:rPr>
-              <w:t>nhiệm vụ</w:t>
+                <w:b w:val="0"/>
+                <w:i w:val="0"/>
+                <w:sz w:val="26"/>
+              </w:rPr>
+              <w:t>Bước 1: Chuyển giao nhiệm vụ học tập:</w:t>
+            </w:r>
+          </w:p>
+          <w:p>
+            <w:pPr>
+              <w:spacing w:line="276" w:lineRule="auto" w:after="40"/>
+              <w:jc w:val="left"/>
+            </w:pPr>
+            <w:r>
+              <w:rPr>
+                <w:rFonts w:ascii="Times New Roman" w:hAnsi="Times New Roman" w:eastAsia="Times New Roman"/>
+                <w:b w:val="0"/>
+                <w:i w:val="0"/>
+                <w:sz w:val="26"/>
+              </w:rPr>
+              <w:t>- GV chiếu hình ảnh/video tình huống liên quan đến Bài 1. Thông tin và dữ liệu.</w:t>
+            </w:r>
+          </w:p>
+          <w:p>
+            <w:pPr>
+              <w:spacing w:line="276" w:lineRule="auto" w:after="40"/>
+              <w:jc w:val="left"/>
+            </w:pPr>
+            <w:r>
+              <w:rPr>
+                <w:rFonts w:ascii="Times New Roman" w:hAnsi="Times New Roman" w:eastAsia="Times New Roman"/>
+                <w:b w:val="0"/>
+                <w:i w:val="0"/>
+                <w:sz w:val="26"/>
+              </w:rPr>
+              <w:t>- GV nêu câu hỏi gợi mở cho cả lớp.</w:t>
+            </w:r>
+          </w:p>
+          <w:p>
+            <w:pPr>
+              <w:spacing w:line="276" w:lineRule="auto" w:after="40"/>
+              <w:jc w:val="left"/>
+            </w:pPr>
+            <w:r>
+              <w:rPr>
+                <w:rFonts w:ascii="Times New Roman" w:hAnsi="Times New Roman" w:eastAsia="Times New Roman"/>
+                <w:b w:val="0"/>
+                <w:i w:val="0"/>
+                <w:sz w:val="26"/>
+              </w:rPr>
+              <w:t>Bước 2: Học sinh tiếp nhận nhiệm vụ học tập:</w:t>
+            </w:r>
+          </w:p>
+          <w:p>
+            <w:pPr>
+              <w:spacing w:line="276" w:lineRule="auto" w:after="40"/>
+              <w:jc w:val="left"/>
+            </w:pPr>
+            <w:r>
+              <w:rPr>
+                <w:rFonts w:ascii="Times New Roman" w:hAnsi="Times New Roman" w:eastAsia="Times New Roman"/>
+                <w:b w:val="0"/>
+                <w:i w:val="0"/>
+                <w:sz w:val="26"/>
+              </w:rPr>
+              <w:t>- HS tập trung quan sát, lắng nghe câu hỏi.</w:t>
+            </w:r>
+          </w:p>
+          <w:p>
+            <w:pPr>
+              <w:spacing w:line="276" w:lineRule="auto" w:after="40"/>
+              <w:jc w:val="left"/>
+            </w:pPr>
+            <w:r>
+              <w:rPr>
+                <w:rFonts w:ascii="Times New Roman" w:hAnsi="Times New Roman" w:eastAsia="Times New Roman"/>
+                <w:b w:val="0"/>
+                <w:i w:val="0"/>
+                <w:sz w:val="26"/>
+              </w:rPr>
+              <w:t>- HS suy nghĩ cá nhân, thảo luận nhanh nhóm đôi.</w:t>
+            </w:r>
+          </w:p>
+          <w:p>
+            <w:pPr>
+              <w:spacing w:line="276" w:lineRule="auto" w:after="40"/>
+              <w:jc w:val="left"/>
+            </w:pPr>
+            <w:r>
+              <w:rPr>
+                <w:rFonts w:ascii="Times New Roman" w:hAnsi="Times New Roman" w:eastAsia="Times New Roman"/>
+                <w:b w:val="0"/>
+                <w:i w:val="0"/>
+                <w:sz w:val="26"/>
+              </w:rPr>
+              <w:t>Bước 3: Báo cáo kết quả hoạt động:</w:t>
+            </w:r>
+          </w:p>
+          <w:p>
+            <w:pPr>
+              <w:spacing w:line="276" w:lineRule="auto" w:after="40"/>
+              <w:jc w:val="left"/>
+            </w:pPr>
+            <w:r>
+              <w:rPr>
+                <w:rFonts w:ascii="Times New Roman" w:hAnsi="Times New Roman" w:eastAsia="Times New Roman"/>
+                <w:b w:val="0"/>
+                <w:i w:val="0"/>
+                <w:sz w:val="26"/>
+              </w:rPr>
+              <w:t>- 2-3 HS giơ tay phát biểu ý kiến.</w:t>
+            </w:r>
+          </w:p>
+          <w:p>
+            <w:pPr>
+              <w:spacing w:line="276" w:lineRule="auto" w:after="40"/>
+              <w:jc w:val="left"/>
+            </w:pPr>
+            <w:r>
+              <w:rPr>
+                <w:rFonts w:ascii="Times New Roman" w:hAnsi="Times New Roman" w:eastAsia="Times New Roman"/>
+                <w:b w:val="0"/>
+                <w:i w:val="0"/>
+                <w:sz w:val="26"/>
+              </w:rPr>
+              <w:t>- Các bạn khác lắng nghe, nhận xét.</w:t>
+            </w:r>
+          </w:p>
+          <w:p>
+            <w:pPr>
+              <w:spacing w:line="276" w:lineRule="auto" w:after="40"/>
+              <w:jc w:val="left"/>
+            </w:pPr>
+            <w:r>
+              <w:rPr>
+                <w:rFonts w:ascii="Times New Roman" w:hAnsi="Times New Roman" w:eastAsia="Times New Roman"/>
+                <w:b w:val="0"/>
+                <w:i w:val="0"/>
+                <w:sz w:val="26"/>
+              </w:rPr>
+              <w:t>Bước 4: Đánh giá kết quả thực hiện nhiệm vụ:</w:t>
+            </w:r>
+          </w:p>
+          <w:p>
+            <w:pPr>
+              <w:spacing w:line="276" w:lineRule="auto" w:after="40"/>
+              <w:jc w:val="left"/>
+            </w:pPr>
+            <w:r>
+              <w:rPr>
+                <w:rFonts w:ascii="Times New Roman" w:hAnsi="Times New Roman" w:eastAsia="Times New Roman"/>
+                <w:b w:val="0"/>
+                <w:i w:val="0"/>
+                <w:sz w:val="26"/>
+              </w:rPr>
+              <w:t>- GV nhận xét, chuẩn hóa và dẫn dắt vào bài mới.</w:t>
             </w:r>
           </w:p>
         </w:tc>
         <w:tc>
           <w:tcPr>
-            <w:tcW w:type="dxa" w:w="3628"/>
+            <w:tcW w:type="dxa" w:w="4875"/>
+            <w:tcMar>
+              <w:top w:w="80" w:type="dxa"/>
+              <w:bottom w:w="80" w:type="dxa"/>
+              <w:left w:w="120" w:type="dxa"/>
+              <w:right w:w="120" w:type="dxa"/>
+            </w:tcMar>
           </w:tcPr>
           <w:p>
             <w:pPr>
-              <w:spacing w:line="276" w:lineRule="auto" w:after="40" w:before="0"/>
+              <w:spacing w:line="276" w:lineRule="auto" w:after="40"/>
               <w:jc w:val="left"/>
             </w:pPr>
             <w:r/>
@@ -899,313 +1058,22 @@
                 <w:i w:val="0"/>
                 <w:sz w:val="26"/>
               </w:rPr>
-              <w:t>GV chiếu hình ảnh/video/tình huống thực tế liên quan đến Bài 1. Thông tin và dữ liệu. Nêu câu hỏi gợi mở cho cả lớp.</w:t>
-            </w:r>
-          </w:p>
-        </w:tc>
-        <w:tc>
-          <w:tcPr>
-            <w:tcW w:type="dxa" w:w="3628"/>
-          </w:tcPr>
-          <w:p>
-            <w:pPr>
-              <w:spacing w:line="276" w:lineRule="auto" w:after="40" w:before="0"/>
-              <w:jc w:val="left"/>
-            </w:pPr>
-            <w:r/>
-            <w:r>
-              <w:rPr>
-                <w:rFonts w:ascii="Times New Roman" w:hAnsi="Times New Roman" w:eastAsia="Times New Roman"/>
-                <w:b w:val="0"/>
-                <w:i w:val="0"/>
-                <w:sz w:val="26"/>
-              </w:rPr>
-              <w:t>HS tập trung quan sát màn chiếu, lắng nghe câu hỏi của GV.</w:t>
-            </w:r>
-          </w:p>
-        </w:tc>
-      </w:tr>
-      <w:tr>
-        <w:tc>
-          <w:tcPr>
-            <w:tcW w:type="dxa" w:w="1814"/>
-          </w:tcPr>
-          <w:p>
-            <w:pPr>
-              <w:spacing w:line="276" w:lineRule="auto" w:after="40" w:before="0"/>
-              <w:jc w:val="center"/>
-            </w:pPr>
-            <w:r/>
-            <w:r>
-              <w:rPr>
-                <w:rFonts w:ascii="Times New Roman" w:hAnsi="Times New Roman" w:eastAsia="Times New Roman"/>
-                <w:b/>
-                <w:i/>
-                <w:sz w:val="26"/>
-              </w:rPr>
-              <w:t>Bước 2:</w:t>
-            </w:r>
-          </w:p>
-          <w:p>
-            <w:pPr>
-              <w:spacing w:line="276" w:lineRule="auto" w:after="40" w:before="0"/>
-              <w:jc w:val="center"/>
-            </w:pPr>
-            <w:r>
-              <w:rPr>
-                <w:rFonts w:ascii="Times New Roman" w:hAnsi="Times New Roman" w:eastAsia="Times New Roman"/>
-                <w:b/>
-                <w:i/>
-                <w:sz w:val="26"/>
-              </w:rPr>
-              <w:t>Học sinh tiếp nhận</w:t>
-            </w:r>
-          </w:p>
-          <w:p>
-            <w:pPr>
-              <w:spacing w:line="276" w:lineRule="auto" w:after="40" w:before="0"/>
-              <w:jc w:val="center"/>
-            </w:pPr>
-            <w:r>
-              <w:rPr>
-                <w:rFonts w:ascii="Times New Roman" w:hAnsi="Times New Roman" w:eastAsia="Times New Roman"/>
-                <w:b/>
-                <w:i/>
-                <w:sz w:val="26"/>
-              </w:rPr>
-              <w:t>nhiệm vụ</w:t>
-            </w:r>
-          </w:p>
-        </w:tc>
-        <w:tc>
-          <w:tcPr>
-            <w:tcW w:type="dxa" w:w="3628"/>
-          </w:tcPr>
-          <w:p>
-            <w:pPr>
-              <w:spacing w:line="276" w:lineRule="auto" w:after="40" w:before="0"/>
-              <w:jc w:val="left"/>
-            </w:pPr>
-            <w:r/>
-            <w:r>
-              <w:rPr>
-                <w:rFonts w:ascii="Times New Roman" w:hAnsi="Times New Roman" w:eastAsia="Times New Roman"/>
-                <w:b w:val="0"/>
-                <w:i w:val="0"/>
-                <w:sz w:val="26"/>
-              </w:rPr>
-              <w:t>GV bao quát lớp, khuyến khích HS suy nghĩ cá nhân hoặc trao đổi nhanh với bạn bên cạnh.</w:t>
-            </w:r>
-          </w:p>
-        </w:tc>
-        <w:tc>
-          <w:tcPr>
-            <w:tcW w:type="dxa" w:w="3628"/>
-          </w:tcPr>
-          <w:p>
-            <w:pPr>
-              <w:spacing w:line="276" w:lineRule="auto" w:after="40" w:before="0"/>
-              <w:jc w:val="left"/>
-            </w:pPr>
-            <w:r/>
-            <w:r>
-              <w:rPr>
-                <w:rFonts w:ascii="Times New Roman" w:hAnsi="Times New Roman" w:eastAsia="Times New Roman"/>
-                <w:b w:val="0"/>
-                <w:i w:val="0"/>
-                <w:sz w:val="26"/>
-              </w:rPr>
-              <w:t>HS suy nghĩ câu trả lời, thảo luận nhanh nhóm đôi.</w:t>
-            </w:r>
-          </w:p>
-        </w:tc>
-      </w:tr>
-      <w:tr>
-        <w:tc>
-          <w:tcPr>
-            <w:tcW w:type="dxa" w:w="1814"/>
-          </w:tcPr>
-          <w:p>
-            <w:pPr>
-              <w:spacing w:line="276" w:lineRule="auto" w:after="40" w:before="0"/>
-              <w:jc w:val="center"/>
-            </w:pPr>
-            <w:r/>
-            <w:r>
-              <w:rPr>
-                <w:rFonts w:ascii="Times New Roman" w:hAnsi="Times New Roman" w:eastAsia="Times New Roman"/>
-                <w:b/>
-                <w:i/>
-                <w:sz w:val="26"/>
-              </w:rPr>
-              <w:t>Bước 3:</w:t>
-            </w:r>
-          </w:p>
-          <w:p>
-            <w:pPr>
-              <w:spacing w:line="276" w:lineRule="auto" w:after="40" w:before="0"/>
-              <w:jc w:val="center"/>
-            </w:pPr>
-            <w:r>
-              <w:rPr>
-                <w:rFonts w:ascii="Times New Roman" w:hAnsi="Times New Roman" w:eastAsia="Times New Roman"/>
-                <w:b/>
-                <w:i/>
-                <w:sz w:val="26"/>
-              </w:rPr>
-              <w:t>Báo cáo kết quả</w:t>
-            </w:r>
-          </w:p>
-          <w:p>
-            <w:pPr>
-              <w:spacing w:line="276" w:lineRule="auto" w:after="40" w:before="0"/>
-              <w:jc w:val="center"/>
-            </w:pPr>
-            <w:r>
-              <w:rPr>
-                <w:rFonts w:ascii="Times New Roman" w:hAnsi="Times New Roman" w:eastAsia="Times New Roman"/>
-                <w:b/>
-                <w:i/>
-                <w:sz w:val="26"/>
-              </w:rPr>
-              <w:t>hoạt động</w:t>
-            </w:r>
-          </w:p>
-        </w:tc>
-        <w:tc>
-          <w:tcPr>
-            <w:tcW w:type="dxa" w:w="3628"/>
-          </w:tcPr>
-          <w:p>
-            <w:pPr>
-              <w:spacing w:line="276" w:lineRule="auto" w:after="40" w:before="0"/>
-              <w:jc w:val="left"/>
-            </w:pPr>
-            <w:r/>
-            <w:r>
-              <w:rPr>
-                <w:rFonts w:ascii="Times New Roman" w:hAnsi="Times New Roman" w:eastAsia="Times New Roman"/>
-                <w:b w:val="0"/>
-                <w:i w:val="0"/>
-                <w:sz w:val="26"/>
-              </w:rPr>
-              <w:t>GV gọi đại diện 2-3 HS giơ tay phát biểu ý kiến.</w:t>
-            </w:r>
-          </w:p>
-        </w:tc>
-        <w:tc>
-          <w:tcPr>
-            <w:tcW w:type="dxa" w:w="3628"/>
-          </w:tcPr>
-          <w:p>
-            <w:pPr>
-              <w:spacing w:line="276" w:lineRule="auto" w:after="40" w:before="0"/>
-              <w:jc w:val="left"/>
-            </w:pPr>
-            <w:r/>
-            <w:r>
-              <w:rPr>
-                <w:rFonts w:ascii="Times New Roman" w:hAnsi="Times New Roman" w:eastAsia="Times New Roman"/>
-                <w:b w:val="0"/>
-                <w:i w:val="0"/>
-                <w:sz w:val="26"/>
-              </w:rPr>
-              <w:t>Đại diện HS nêu câu trả lời, các bạn khác lắng nghe và nhận xét.</w:t>
-            </w:r>
-          </w:p>
-        </w:tc>
-      </w:tr>
-      <w:tr>
-        <w:tc>
-          <w:tcPr>
-            <w:tcW w:type="dxa" w:w="1814"/>
-          </w:tcPr>
-          <w:p>
-            <w:pPr>
-              <w:spacing w:line="276" w:lineRule="auto" w:after="40" w:before="0"/>
-              <w:jc w:val="center"/>
-            </w:pPr>
-            <w:r/>
-            <w:r>
-              <w:rPr>
-                <w:rFonts w:ascii="Times New Roman" w:hAnsi="Times New Roman" w:eastAsia="Times New Roman"/>
-                <w:b/>
-                <w:i/>
-                <w:sz w:val="26"/>
-              </w:rPr>
-              <w:t>Bước 4:</w:t>
-            </w:r>
-          </w:p>
-          <w:p>
-            <w:pPr>
-              <w:spacing w:line="276" w:lineRule="auto" w:after="40" w:before="0"/>
-              <w:jc w:val="center"/>
-            </w:pPr>
-            <w:r>
-              <w:rPr>
-                <w:rFonts w:ascii="Times New Roman" w:hAnsi="Times New Roman" w:eastAsia="Times New Roman"/>
-                <w:b/>
-                <w:i/>
-                <w:sz w:val="26"/>
-              </w:rPr>
-              <w:t>Đánh giá kết quả</w:t>
-            </w:r>
-          </w:p>
-          <w:p>
-            <w:pPr>
-              <w:spacing w:line="276" w:lineRule="auto" w:after="40" w:before="0"/>
-              <w:jc w:val="center"/>
-            </w:pPr>
-            <w:r>
-              <w:rPr>
-                <w:rFonts w:ascii="Times New Roman" w:hAnsi="Times New Roman" w:eastAsia="Times New Roman"/>
-                <w:b/>
-                <w:i/>
-                <w:sz w:val="26"/>
-              </w:rPr>
-              <w:t>thực hiện nhiệm vụ</w:t>
-            </w:r>
-          </w:p>
-        </w:tc>
-        <w:tc>
-          <w:tcPr>
-            <w:tcW w:type="dxa" w:w="3628"/>
-          </w:tcPr>
-          <w:p>
-            <w:pPr>
-              <w:spacing w:line="276" w:lineRule="auto" w:after="40" w:before="0"/>
-              <w:jc w:val="left"/>
-            </w:pPr>
-            <w:r/>
-            <w:r>
-              <w:rPr>
-                <w:rFonts w:ascii="Times New Roman" w:hAnsi="Times New Roman" w:eastAsia="Times New Roman"/>
-                <w:b w:val="0"/>
-                <w:i w:val="0"/>
-                <w:sz w:val="26"/>
-              </w:rPr>
-              <w:t>GV nhận xét, chuẩn hóa ý kiến và dẫn dắt giới thiệu vào bài học mới.</w:t>
-            </w:r>
-          </w:p>
-        </w:tc>
-        <w:tc>
-          <w:tcPr>
-            <w:tcW w:type="dxa" w:w="3628"/>
-          </w:tcPr>
-          <w:p>
-            <w:pPr>
-              <w:spacing w:line="276" w:lineRule="auto" w:after="40" w:before="0"/>
-              <w:jc w:val="left"/>
-            </w:pPr>
-            <w:r/>
-            <w:r>
-              <w:rPr>
-                <w:rFonts w:ascii="Times New Roman" w:hAnsi="Times New Roman" w:eastAsia="Times New Roman"/>
-                <w:b w:val="0"/>
-                <w:i w:val="0"/>
-                <w:sz w:val="26"/>
-              </w:rPr>
-              <w:t>HS lắng nghe, mở SGK và vở ghi chuẩn bị nội dung bài mới.</w:t>
+              <w:t>HS nhận diện được vấn đề bài học.</w:t>
+            </w:r>
+          </w:p>
+          <w:p>
+            <w:pPr>
+              <w:spacing w:line="276" w:lineRule="auto" w:after="40"/>
+              <w:jc w:val="left"/>
+            </w:pPr>
+            <w:r>
+              <w:rPr>
+                <w:rFonts w:ascii="Times New Roman" w:hAnsi="Times New Roman" w:eastAsia="Times New Roman"/>
+                <w:b w:val="0"/>
+                <w:i w:val="0"/>
+                <w:sz w:val="26"/>
+              </w:rPr>
+              <w:t>HS hứng thú, sẵn sàng tìm hiểu nội dung mới.</w:t>
             </w:r>
           </w:p>
         </w:tc>
@@ -1280,7 +1148,7 @@
           <w:i/>
           <w:sz w:val="26"/>
         </w:rPr>
-        <w:t>Tìm hiểu kiến thức trong SGK, quan sát GV làm mẫu thao tác và phân tích các bước thực hiện.</w:t>
+        <w:t>Tìm hiểu kiến thức trong SGK, quan sát GV làm mẫu thao tác.</w:t>
       </w:r>
     </w:p>
     <w:p>
@@ -1338,18 +1206,23 @@
         </w:tblBorders>
       </w:tblPr>
       <w:tblGrid>
-        <w:gridCol w:w="3198"/>
-        <w:gridCol w:w="3198"/>
-        <w:gridCol w:w="3198"/>
+        <w:gridCol w:w="4875"/>
+        <w:gridCol w:w="4875"/>
       </w:tblGrid>
       <w:tr>
         <w:tc>
           <w:tcPr>
-            <w:tcW w:type="dxa" w:w="1814"/>
+            <w:tcW w:type="dxa" w:w="5102"/>
+            <w:tcMar>
+              <w:top w:w="80" w:type="dxa"/>
+              <w:bottom w:w="80" w:type="dxa"/>
+              <w:left w:w="120" w:type="dxa"/>
+              <w:right w:w="120" w:type="dxa"/>
+            </w:tcMar>
           </w:tcPr>
           <w:p>
             <w:pPr>
-              <w:spacing w:line="276" w:lineRule="auto" w:after="40" w:before="0"/>
+              <w:spacing w:line="276" w:lineRule="auto" w:after="40"/>
               <w:jc w:val="center"/>
             </w:pPr>
             <w:r/>
@@ -1360,17 +1233,23 @@
                 <w:i w:val="0"/>
                 <w:sz w:val="26"/>
               </w:rPr>
-              <w:t>Bước</w:t>
+              <w:t>HOẠT ĐỘNG CỦA GV – HS</w:t>
             </w:r>
           </w:p>
         </w:tc>
         <w:tc>
           <w:tcPr>
-            <w:tcW w:type="dxa" w:w="3628"/>
+            <w:tcW w:type="dxa" w:w="3969"/>
+            <w:tcMar>
+              <w:top w:w="80" w:type="dxa"/>
+              <w:bottom w:w="80" w:type="dxa"/>
+              <w:left w:w="120" w:type="dxa"/>
+              <w:right w:w="120" w:type="dxa"/>
+            </w:tcMar>
           </w:tcPr>
           <w:p>
             <w:pPr>
-              <w:spacing w:line="276" w:lineRule="auto" w:after="40" w:before="0"/>
+              <w:spacing w:line="276" w:lineRule="auto" w:after="40"/>
               <w:jc w:val="center"/>
             </w:pPr>
             <w:r/>
@@ -1381,28 +1260,7 @@
                 <w:i w:val="0"/>
                 <w:sz w:val="26"/>
               </w:rPr>
-              <w:t>Hoạt động của GV</w:t>
-            </w:r>
-          </w:p>
-        </w:tc>
-        <w:tc>
-          <w:tcPr>
-            <w:tcW w:type="dxa" w:w="3628"/>
-          </w:tcPr>
-          <w:p>
-            <w:pPr>
-              <w:spacing w:line="276" w:lineRule="auto" w:after="40" w:before="0"/>
-              <w:jc w:val="center"/>
-            </w:pPr>
-            <w:r/>
-            <w:r>
-              <w:rPr>
-                <w:rFonts w:ascii="Times New Roman" w:hAnsi="Times New Roman" w:eastAsia="Times New Roman"/>
-                <w:b/>
-                <w:i w:val="0"/>
-                <w:sz w:val="26"/>
-              </w:rPr>
-              <w:t>Hoạt động của HS</w:t>
+              <w:t>KẾT QUẢ CẦN ĐẠT</w:t>
             </w:r>
           </w:p>
         </w:tc>
@@ -1410,62 +1268,179 @@
       <w:tr>
         <w:tc>
           <w:tcPr>
-            <w:tcW w:type="dxa" w:w="1814"/>
+            <w:tcW w:type="dxa" w:w="4875"/>
+            <w:tcMar>
+              <w:top w:w="80" w:type="dxa"/>
+              <w:bottom w:w="80" w:type="dxa"/>
+              <w:left w:w="120" w:type="dxa"/>
+              <w:right w:w="120" w:type="dxa"/>
+            </w:tcMar>
           </w:tcPr>
           <w:p>
             <w:pPr>
-              <w:spacing w:line="276" w:lineRule="auto" w:after="40" w:before="0"/>
-              <w:jc w:val="center"/>
+              <w:spacing w:line="276" w:lineRule="auto" w:after="40"/>
+              <w:jc w:val="left"/>
             </w:pPr>
             <w:r/>
             <w:r>
               <w:rPr>
                 <w:rFonts w:ascii="Times New Roman" w:hAnsi="Times New Roman" w:eastAsia="Times New Roman"/>
-                <w:b/>
-                <w:i/>
-                <w:sz w:val="26"/>
-              </w:rPr>
-              <w:t>Bước 1:</w:t>
-            </w:r>
-          </w:p>
-          <w:p>
-            <w:pPr>
-              <w:spacing w:line="276" w:lineRule="auto" w:after="40" w:before="0"/>
-              <w:jc w:val="center"/>
-            </w:pPr>
-            <w:r>
-              <w:rPr>
-                <w:rFonts w:ascii="Times New Roman" w:hAnsi="Times New Roman" w:eastAsia="Times New Roman"/>
-                <w:b/>
-                <w:i/>
-                <w:sz w:val="26"/>
-              </w:rPr>
-              <w:t>Chuyển giao</w:t>
-            </w:r>
-          </w:p>
-          <w:p>
-            <w:pPr>
-              <w:spacing w:line="276" w:lineRule="auto" w:after="40" w:before="0"/>
-              <w:jc w:val="center"/>
-            </w:pPr>
-            <w:r>
-              <w:rPr>
-                <w:rFonts w:ascii="Times New Roman" w:hAnsi="Times New Roman" w:eastAsia="Times New Roman"/>
-                <w:b/>
-                <w:i/>
-                <w:sz w:val="26"/>
-              </w:rPr>
-              <w:t>nhiệm vụ</w:t>
+                <w:b w:val="0"/>
+                <w:i w:val="0"/>
+                <w:sz w:val="26"/>
+              </w:rPr>
+              <w:t>Bước 1: Chuyển giao nhiệm vụ học tập:</w:t>
+            </w:r>
+          </w:p>
+          <w:p>
+            <w:pPr>
+              <w:spacing w:line="276" w:lineRule="auto" w:after="40"/>
+              <w:jc w:val="left"/>
+            </w:pPr>
+            <w:r>
+              <w:rPr>
+                <w:rFonts w:ascii="Times New Roman" w:hAnsi="Times New Roman" w:eastAsia="Times New Roman"/>
+                <w:b w:val="0"/>
+                <w:i w:val="0"/>
+                <w:sz w:val="26"/>
+              </w:rPr>
+              <w:t>- GV giao nhiệm vụ: đọc SGK và theo dõi thao tác mẫu trên máy chiếu.</w:t>
+            </w:r>
+          </w:p>
+          <w:p>
+            <w:pPr>
+              <w:spacing w:line="276" w:lineRule="auto" w:after="40"/>
+              <w:jc w:val="left"/>
+            </w:pPr>
+            <w:r>
+              <w:rPr>
+                <w:rFonts w:ascii="Times New Roman" w:hAnsi="Times New Roman" w:eastAsia="Times New Roman"/>
+                <w:b w:val="0"/>
+                <w:i w:val="0"/>
+                <w:sz w:val="26"/>
+              </w:rPr>
+              <w:t>Bước 2: Học sinh tiếp nhận nhiệm vụ học tập:</w:t>
+            </w:r>
+          </w:p>
+          <w:p>
+            <w:pPr>
+              <w:spacing w:line="276" w:lineRule="auto" w:after="40"/>
+              <w:jc w:val="left"/>
+            </w:pPr>
+            <w:r>
+              <w:rPr>
+                <w:rFonts w:ascii="Times New Roman" w:hAnsi="Times New Roman" w:eastAsia="Times New Roman"/>
+                <w:b w:val="0"/>
+                <w:i w:val="0"/>
+                <w:sz w:val="26"/>
+              </w:rPr>
+              <w:t>- HS mở SGK trang tương ứng và quan sát màn chiếu.</w:t>
+            </w:r>
+          </w:p>
+          <w:p>
+            <w:pPr>
+              <w:spacing w:line="276" w:lineRule="auto" w:after="40"/>
+              <w:jc w:val="left"/>
+            </w:pPr>
+            <w:r>
+              <w:rPr>
+                <w:rFonts w:ascii="Times New Roman" w:hAnsi="Times New Roman" w:eastAsia="Times New Roman"/>
+                <w:b w:val="0"/>
+                <w:i w:val="0"/>
+                <w:sz w:val="26"/>
+              </w:rPr>
+              <w:t>- HS ghi chép từ khóa chính vào vở.</w:t>
+            </w:r>
+          </w:p>
+          <w:p>
+            <w:pPr>
+              <w:spacing w:line="276" w:lineRule="auto" w:after="40"/>
+              <w:jc w:val="left"/>
+            </w:pPr>
+            <w:r>
+              <w:rPr>
+                <w:rFonts w:ascii="Times New Roman" w:hAnsi="Times New Roman" w:eastAsia="Times New Roman"/>
+                <w:b w:val="0"/>
+                <w:i w:val="0"/>
+                <w:sz w:val="26"/>
+              </w:rPr>
+              <w:t>Bước 3: Báo cáo kết quả hoạt động:</w:t>
+            </w:r>
+          </w:p>
+          <w:p>
+            <w:pPr>
+              <w:spacing w:line="276" w:lineRule="auto" w:after="40"/>
+              <w:jc w:val="left"/>
+            </w:pPr>
+            <w:r>
+              <w:rPr>
+                <w:rFonts w:ascii="Times New Roman" w:hAnsi="Times New Roman" w:eastAsia="Times New Roman"/>
+                <w:b w:val="0"/>
+                <w:i w:val="0"/>
+                <w:sz w:val="26"/>
+              </w:rPr>
+              <w:t>- 1-2 HS lên máy GV thực hiện lại thao tác mẫu.</w:t>
+            </w:r>
+          </w:p>
+          <w:p>
+            <w:pPr>
+              <w:spacing w:line="276" w:lineRule="auto" w:after="40"/>
+              <w:jc w:val="left"/>
+            </w:pPr>
+            <w:r>
+              <w:rPr>
+                <w:rFonts w:ascii="Times New Roman" w:hAnsi="Times New Roman" w:eastAsia="Times New Roman"/>
+                <w:b w:val="0"/>
+                <w:i w:val="0"/>
+                <w:sz w:val="26"/>
+              </w:rPr>
+              <w:t>- Cả lớp quan sát, nhận xét.</w:t>
+            </w:r>
+          </w:p>
+          <w:p>
+            <w:pPr>
+              <w:spacing w:line="276" w:lineRule="auto" w:after="40"/>
+              <w:jc w:val="left"/>
+            </w:pPr>
+            <w:r>
+              <w:rPr>
+                <w:rFonts w:ascii="Times New Roman" w:hAnsi="Times New Roman" w:eastAsia="Times New Roman"/>
+                <w:b w:val="0"/>
+                <w:i w:val="0"/>
+                <w:sz w:val="26"/>
+              </w:rPr>
+              <w:t>Bước 4: Đánh giá kết quả thực hiện nhiệm vụ:</w:t>
+            </w:r>
+          </w:p>
+          <w:p>
+            <w:pPr>
+              <w:spacing w:line="276" w:lineRule="auto" w:after="40"/>
+              <w:jc w:val="left"/>
+            </w:pPr>
+            <w:r>
+              <w:rPr>
+                <w:rFonts w:ascii="Times New Roman" w:hAnsi="Times New Roman" w:eastAsia="Times New Roman"/>
+                <w:b w:val="0"/>
+                <w:i w:val="0"/>
+                <w:sz w:val="26"/>
+              </w:rPr>
+              <w:t>- GV chuẩn hóa kiến thức lý thuyết và chốt quy trình thao tác.</w:t>
             </w:r>
           </w:p>
         </w:tc>
         <w:tc>
           <w:tcPr>
-            <w:tcW w:type="dxa" w:w="3628"/>
+            <w:tcW w:type="dxa" w:w="4875"/>
+            <w:tcMar>
+              <w:top w:w="80" w:type="dxa"/>
+              <w:bottom w:w="80" w:type="dxa"/>
+              <w:left w:w="120" w:type="dxa"/>
+              <w:right w:w="120" w:type="dxa"/>
+            </w:tcMar>
           </w:tcPr>
           <w:p>
             <w:pPr>
-              <w:spacing w:line="276" w:lineRule="auto" w:after="40" w:before="0"/>
+              <w:spacing w:line="276" w:lineRule="auto" w:after="40"/>
               <w:jc w:val="left"/>
             </w:pPr>
             <w:r/>
@@ -1476,313 +1451,22 @@
                 <w:i w:val="0"/>
                 <w:sz w:val="26"/>
               </w:rPr>
-              <w:t>GV giao nhiệm vụ: Yêu cầu HS đọc thông tin SGK và theo dõi GV làm mẫu thao tác Bài 1. Thông tin và dữ liệu trên máy chiếu.</w:t>
-            </w:r>
-          </w:p>
-        </w:tc>
-        <w:tc>
-          <w:tcPr>
-            <w:tcW w:type="dxa" w:w="3628"/>
-          </w:tcPr>
-          <w:p>
-            <w:pPr>
-              <w:spacing w:line="276" w:lineRule="auto" w:after="40" w:before="0"/>
-              <w:jc w:val="left"/>
-            </w:pPr>
-            <w:r/>
-            <w:r>
-              <w:rPr>
-                <w:rFonts w:ascii="Times New Roman" w:hAnsi="Times New Roman" w:eastAsia="Times New Roman"/>
-                <w:b w:val="0"/>
-                <w:i w:val="0"/>
-                <w:sz w:val="26"/>
-              </w:rPr>
-              <w:t>HS tiếp nhận nhiệm vụ, mở SGK trang tương ứng và quan sát màn chiếu.</w:t>
-            </w:r>
-          </w:p>
-        </w:tc>
-      </w:tr>
-      <w:tr>
-        <w:tc>
-          <w:tcPr>
-            <w:tcW w:type="dxa" w:w="1814"/>
-          </w:tcPr>
-          <w:p>
-            <w:pPr>
-              <w:spacing w:line="276" w:lineRule="auto" w:after="40" w:before="0"/>
-              <w:jc w:val="center"/>
-            </w:pPr>
-            <w:r/>
-            <w:r>
-              <w:rPr>
-                <w:rFonts w:ascii="Times New Roman" w:hAnsi="Times New Roman" w:eastAsia="Times New Roman"/>
-                <w:b/>
-                <w:i/>
-                <w:sz w:val="26"/>
-              </w:rPr>
-              <w:t>Bước 2:</w:t>
-            </w:r>
-          </w:p>
-          <w:p>
-            <w:pPr>
-              <w:spacing w:line="276" w:lineRule="auto" w:after="40" w:before="0"/>
-              <w:jc w:val="center"/>
-            </w:pPr>
-            <w:r>
-              <w:rPr>
-                <w:rFonts w:ascii="Times New Roman" w:hAnsi="Times New Roman" w:eastAsia="Times New Roman"/>
-                <w:b/>
-                <w:i/>
-                <w:sz w:val="26"/>
-              </w:rPr>
-              <w:t>Học sinh tiếp nhận</w:t>
-            </w:r>
-          </w:p>
-          <w:p>
-            <w:pPr>
-              <w:spacing w:line="276" w:lineRule="auto" w:after="40" w:before="0"/>
-              <w:jc w:val="center"/>
-            </w:pPr>
-            <w:r>
-              <w:rPr>
-                <w:rFonts w:ascii="Times New Roman" w:hAnsi="Times New Roman" w:eastAsia="Times New Roman"/>
-                <w:b/>
-                <w:i/>
-                <w:sz w:val="26"/>
-              </w:rPr>
-              <w:t>nhiệm vụ</w:t>
-            </w:r>
-          </w:p>
-        </w:tc>
-        <w:tc>
-          <w:tcPr>
-            <w:tcW w:type="dxa" w:w="3628"/>
-          </w:tcPr>
-          <w:p>
-            <w:pPr>
-              <w:spacing w:line="276" w:lineRule="auto" w:after="40" w:before="0"/>
-              <w:jc w:val="left"/>
-            </w:pPr>
-            <w:r/>
-            <w:r>
-              <w:rPr>
-                <w:rFonts w:ascii="Times New Roman" w:hAnsi="Times New Roman" w:eastAsia="Times New Roman"/>
-                <w:b w:val="0"/>
-                <w:i w:val="0"/>
-                <w:sz w:val="26"/>
-              </w:rPr>
-              <w:t>GV hướng dẫn từng bước chi tiết, nhấn mạnh các lưu ý và lỗi thường gặp khi thao tác.</w:t>
-            </w:r>
-          </w:p>
-        </w:tc>
-        <w:tc>
-          <w:tcPr>
-            <w:tcW w:type="dxa" w:w="3628"/>
-          </w:tcPr>
-          <w:p>
-            <w:pPr>
-              <w:spacing w:line="276" w:lineRule="auto" w:after="40" w:before="0"/>
-              <w:jc w:val="left"/>
-            </w:pPr>
-            <w:r/>
-            <w:r>
-              <w:rPr>
-                <w:rFonts w:ascii="Times New Roman" w:hAnsi="Times New Roman" w:eastAsia="Times New Roman"/>
-                <w:b w:val="0"/>
-                <w:i w:val="0"/>
-                <w:sz w:val="26"/>
-              </w:rPr>
-              <w:t>HS theo dõi kỹ các bước, ghi chép từ khóa chính và thứ tự các bước vào vở.</w:t>
-            </w:r>
-          </w:p>
-        </w:tc>
-      </w:tr>
-      <w:tr>
-        <w:tc>
-          <w:tcPr>
-            <w:tcW w:type="dxa" w:w="1814"/>
-          </w:tcPr>
-          <w:p>
-            <w:pPr>
-              <w:spacing w:line="276" w:lineRule="auto" w:after="40" w:before="0"/>
-              <w:jc w:val="center"/>
-            </w:pPr>
-            <w:r/>
-            <w:r>
-              <w:rPr>
-                <w:rFonts w:ascii="Times New Roman" w:hAnsi="Times New Roman" w:eastAsia="Times New Roman"/>
-                <w:b/>
-                <w:i/>
-                <w:sz w:val="26"/>
-              </w:rPr>
-              <w:t>Bước 3:</w:t>
-            </w:r>
-          </w:p>
-          <w:p>
-            <w:pPr>
-              <w:spacing w:line="276" w:lineRule="auto" w:after="40" w:before="0"/>
-              <w:jc w:val="center"/>
-            </w:pPr>
-            <w:r>
-              <w:rPr>
-                <w:rFonts w:ascii="Times New Roman" w:hAnsi="Times New Roman" w:eastAsia="Times New Roman"/>
-                <w:b/>
-                <w:i/>
-                <w:sz w:val="26"/>
-              </w:rPr>
-              <w:t>Báo cáo kết quả</w:t>
-            </w:r>
-          </w:p>
-          <w:p>
-            <w:pPr>
-              <w:spacing w:line="276" w:lineRule="auto" w:after="40" w:before="0"/>
-              <w:jc w:val="center"/>
-            </w:pPr>
-            <w:r>
-              <w:rPr>
-                <w:rFonts w:ascii="Times New Roman" w:hAnsi="Times New Roman" w:eastAsia="Times New Roman"/>
-                <w:b/>
-                <w:i/>
-                <w:sz w:val="26"/>
-              </w:rPr>
-              <w:t>hoạt động</w:t>
-            </w:r>
-          </w:p>
-        </w:tc>
-        <w:tc>
-          <w:tcPr>
-            <w:tcW w:type="dxa" w:w="3628"/>
-          </w:tcPr>
-          <w:p>
-            <w:pPr>
-              <w:spacing w:line="276" w:lineRule="auto" w:after="40" w:before="0"/>
-              <w:jc w:val="left"/>
-            </w:pPr>
-            <w:r/>
-            <w:r>
-              <w:rPr>
-                <w:rFonts w:ascii="Times New Roman" w:hAnsi="Times New Roman" w:eastAsia="Times New Roman"/>
-                <w:b w:val="0"/>
-                <w:i w:val="0"/>
-                <w:sz w:val="26"/>
-              </w:rPr>
-              <w:t>GV gọi 1-2 HS đại diện lên máy GV thực hiện lại thao tác mẫu hoặc trả lời câu hỏi kiểm tra.</w:t>
-            </w:r>
-          </w:p>
-        </w:tc>
-        <w:tc>
-          <w:tcPr>
-            <w:tcW w:type="dxa" w:w="3628"/>
-          </w:tcPr>
-          <w:p>
-            <w:pPr>
-              <w:spacing w:line="276" w:lineRule="auto" w:after="40" w:before="0"/>
-              <w:jc w:val="left"/>
-            </w:pPr>
-            <w:r/>
-            <w:r>
-              <w:rPr>
-                <w:rFonts w:ascii="Times New Roman" w:hAnsi="Times New Roman" w:eastAsia="Times New Roman"/>
-                <w:b w:val="0"/>
-                <w:i w:val="0"/>
-                <w:sz w:val="26"/>
-              </w:rPr>
-              <w:t>Đại diện HS thực hiện thao tác/phát biểu; cả lớp quan sát và nhận xét.</w:t>
-            </w:r>
-          </w:p>
-        </w:tc>
-      </w:tr>
-      <w:tr>
-        <w:tc>
-          <w:tcPr>
-            <w:tcW w:type="dxa" w:w="1814"/>
-          </w:tcPr>
-          <w:p>
-            <w:pPr>
-              <w:spacing w:line="276" w:lineRule="auto" w:after="40" w:before="0"/>
-              <w:jc w:val="center"/>
-            </w:pPr>
-            <w:r/>
-            <w:r>
-              <w:rPr>
-                <w:rFonts w:ascii="Times New Roman" w:hAnsi="Times New Roman" w:eastAsia="Times New Roman"/>
-                <w:b/>
-                <w:i/>
-                <w:sz w:val="26"/>
-              </w:rPr>
-              <w:t>Bước 4:</w:t>
-            </w:r>
-          </w:p>
-          <w:p>
-            <w:pPr>
-              <w:spacing w:line="276" w:lineRule="auto" w:after="40" w:before="0"/>
-              <w:jc w:val="center"/>
-            </w:pPr>
-            <w:r>
-              <w:rPr>
-                <w:rFonts w:ascii="Times New Roman" w:hAnsi="Times New Roman" w:eastAsia="Times New Roman"/>
-                <w:b/>
-                <w:i/>
-                <w:sz w:val="26"/>
-              </w:rPr>
-              <w:t>Đánh giá kết quả</w:t>
-            </w:r>
-          </w:p>
-          <w:p>
-            <w:pPr>
-              <w:spacing w:line="276" w:lineRule="auto" w:after="40" w:before="0"/>
-              <w:jc w:val="center"/>
-            </w:pPr>
-            <w:r>
-              <w:rPr>
-                <w:rFonts w:ascii="Times New Roman" w:hAnsi="Times New Roman" w:eastAsia="Times New Roman"/>
-                <w:b/>
-                <w:i/>
-                <w:sz w:val="26"/>
-              </w:rPr>
-              <w:t>thực hiện nhiệm vụ</w:t>
-            </w:r>
-          </w:p>
-        </w:tc>
-        <w:tc>
-          <w:tcPr>
-            <w:tcW w:type="dxa" w:w="3628"/>
-          </w:tcPr>
-          <w:p>
-            <w:pPr>
-              <w:spacing w:line="276" w:lineRule="auto" w:after="40" w:before="0"/>
-              <w:jc w:val="left"/>
-            </w:pPr>
-            <w:r/>
-            <w:r>
-              <w:rPr>
-                <w:rFonts w:ascii="Times New Roman" w:hAnsi="Times New Roman" w:eastAsia="Times New Roman"/>
-                <w:b w:val="0"/>
-                <w:i w:val="0"/>
-                <w:sz w:val="26"/>
-              </w:rPr>
-              <w:t>GV chuẩn hóa kiến thức lý thuyết và chốt quy trình thao tác chuẩn xác.</w:t>
-            </w:r>
-          </w:p>
-        </w:tc>
-        <w:tc>
-          <w:tcPr>
-            <w:tcW w:type="dxa" w:w="3628"/>
-          </w:tcPr>
-          <w:p>
-            <w:pPr>
-              <w:spacing w:line="276" w:lineRule="auto" w:after="40" w:before="0"/>
-              <w:jc w:val="left"/>
-            </w:pPr>
-            <w:r/>
-            <w:r>
-              <w:rPr>
-                <w:rFonts w:ascii="Times New Roman" w:hAnsi="Times New Roman" w:eastAsia="Times New Roman"/>
-                <w:b w:val="0"/>
-                <w:i w:val="0"/>
-                <w:sz w:val="26"/>
-              </w:rPr>
-              <w:t>HS hoàn thiện ghi nhớ kiến thức chuẩn và chuẩn bị thực hành trên máy.</w:t>
+              <w:t>Kiến thức lý thuyết chuẩn.</w:t>
+            </w:r>
+          </w:p>
+          <w:p>
+            <w:pPr>
+              <w:spacing w:line="276" w:lineRule="auto" w:after="40"/>
+              <w:jc w:val="left"/>
+            </w:pPr>
+            <w:r>
+              <w:rPr>
+                <w:rFonts w:ascii="Times New Roman" w:hAnsi="Times New Roman" w:eastAsia="Times New Roman"/>
+                <w:b w:val="0"/>
+                <w:i w:val="0"/>
+                <w:sz w:val="26"/>
+              </w:rPr>
+              <w:t>Quy trình thao tác đúng.</w:t>
             </w:r>
           </w:p>
         </w:tc>
@@ -1832,7 +1516,7 @@
           <w:i/>
           <w:sz w:val="26"/>
         </w:rPr>
-        <w:t>HS rèn luyện kỹ năng thực hành, củng cố và vận dụng kiến thức bài Bài 1. Thông tin và dữ liệu trên máy tính.</w:t>
+        <w:t>HS rèn luyện kỹ năng thực hành trên máy tính.</w:t>
       </w:r>
     </w:p>
     <w:p>
@@ -1857,7 +1541,7 @@
           <w:i/>
           <w:sz w:val="26"/>
         </w:rPr>
-        <w:t>Thực hành cá nhân/nhóm đôi trên máy tính theo các bài tập luyện tập trong SGK/phiếu bài tập.</w:t>
+        <w:t>Thực hành cá nhân/nhóm đôi trên máy tính theo bài tập SGK/phiếu bài tập.</w:t>
       </w:r>
     </w:p>
     <w:p>
@@ -1882,7 +1566,7 @@
           <w:i/>
           <w:sz w:val="26"/>
         </w:rPr>
-        <w:t>Sản phẩm thực hành trên phần mềm/tệp kết quả đạt yêu cầu kỹ thuật.</w:t>
+        <w:t>Sản phẩm thực hành trên phần mềm đạt yêu cầu kỹ thuật.</w:t>
       </w:r>
     </w:p>
     <w:p>
@@ -1915,18 +1599,23 @@
         </w:tblBorders>
       </w:tblPr>
       <w:tblGrid>
-        <w:gridCol w:w="3198"/>
-        <w:gridCol w:w="3198"/>
-        <w:gridCol w:w="3198"/>
+        <w:gridCol w:w="4875"/>
+        <w:gridCol w:w="4875"/>
       </w:tblGrid>
       <w:tr>
         <w:tc>
           <w:tcPr>
-            <w:tcW w:type="dxa" w:w="1814"/>
+            <w:tcW w:type="dxa" w:w="5102"/>
+            <w:tcMar>
+              <w:top w:w="80" w:type="dxa"/>
+              <w:bottom w:w="80" w:type="dxa"/>
+              <w:left w:w="120" w:type="dxa"/>
+              <w:right w:w="120" w:type="dxa"/>
+            </w:tcMar>
           </w:tcPr>
           <w:p>
             <w:pPr>
-              <w:spacing w:line="276" w:lineRule="auto" w:after="40" w:before="0"/>
+              <w:spacing w:line="276" w:lineRule="auto" w:after="40"/>
               <w:jc w:val="center"/>
             </w:pPr>
             <w:r/>
@@ -1937,17 +1626,23 @@
                 <w:i w:val="0"/>
                 <w:sz w:val="26"/>
               </w:rPr>
-              <w:t>Bước</w:t>
+              <w:t>HOẠT ĐỘNG CỦA GV – HS</w:t>
             </w:r>
           </w:p>
         </w:tc>
         <w:tc>
           <w:tcPr>
-            <w:tcW w:type="dxa" w:w="3628"/>
+            <w:tcW w:type="dxa" w:w="3969"/>
+            <w:tcMar>
+              <w:top w:w="80" w:type="dxa"/>
+              <w:bottom w:w="80" w:type="dxa"/>
+              <w:left w:w="120" w:type="dxa"/>
+              <w:right w:w="120" w:type="dxa"/>
+            </w:tcMar>
           </w:tcPr>
           <w:p>
             <w:pPr>
-              <w:spacing w:line="276" w:lineRule="auto" w:after="40" w:before="0"/>
+              <w:spacing w:line="276" w:lineRule="auto" w:after="40"/>
               <w:jc w:val="center"/>
             </w:pPr>
             <w:r/>
@@ -1958,28 +1653,7 @@
                 <w:i w:val="0"/>
                 <w:sz w:val="26"/>
               </w:rPr>
-              <w:t>Hoạt động của GV</w:t>
-            </w:r>
-          </w:p>
-        </w:tc>
-        <w:tc>
-          <w:tcPr>
-            <w:tcW w:type="dxa" w:w="3628"/>
-          </w:tcPr>
-          <w:p>
-            <w:pPr>
-              <w:spacing w:line="276" w:lineRule="auto" w:after="40" w:before="0"/>
-              <w:jc w:val="center"/>
-            </w:pPr>
-            <w:r/>
-            <w:r>
-              <w:rPr>
-                <w:rFonts w:ascii="Times New Roman" w:hAnsi="Times New Roman" w:eastAsia="Times New Roman"/>
-                <w:b/>
-                <w:i w:val="0"/>
-                <w:sz w:val="26"/>
-              </w:rPr>
-              <w:t>Hoạt động của HS</w:t>
+              <w:t>KẾT QUẢ CẦN ĐẠT</w:t>
             </w:r>
           </w:p>
         </w:tc>
@@ -1987,62 +1661,194 @@
       <w:tr>
         <w:tc>
           <w:tcPr>
-            <w:tcW w:type="dxa" w:w="1814"/>
+            <w:tcW w:type="dxa" w:w="4875"/>
+            <w:tcMar>
+              <w:top w:w="80" w:type="dxa"/>
+              <w:bottom w:w="80" w:type="dxa"/>
+              <w:left w:w="120" w:type="dxa"/>
+              <w:right w:w="120" w:type="dxa"/>
+            </w:tcMar>
           </w:tcPr>
           <w:p>
             <w:pPr>
-              <w:spacing w:line="276" w:lineRule="auto" w:after="40" w:before="0"/>
-              <w:jc w:val="center"/>
+              <w:spacing w:line="276" w:lineRule="auto" w:after="40"/>
+              <w:jc w:val="left"/>
             </w:pPr>
             <w:r/>
             <w:r>
               <w:rPr>
                 <w:rFonts w:ascii="Times New Roman" w:hAnsi="Times New Roman" w:eastAsia="Times New Roman"/>
-                <w:b/>
-                <w:i/>
-                <w:sz w:val="26"/>
-              </w:rPr>
-              <w:t>Bước 1:</w:t>
-            </w:r>
-          </w:p>
-          <w:p>
-            <w:pPr>
-              <w:spacing w:line="276" w:lineRule="auto" w:after="40" w:before="0"/>
-              <w:jc w:val="center"/>
-            </w:pPr>
-            <w:r>
-              <w:rPr>
-                <w:rFonts w:ascii="Times New Roman" w:hAnsi="Times New Roman" w:eastAsia="Times New Roman"/>
-                <w:b/>
-                <w:i/>
-                <w:sz w:val="26"/>
-              </w:rPr>
-              <w:t>Chuyển giao</w:t>
-            </w:r>
-          </w:p>
-          <w:p>
-            <w:pPr>
-              <w:spacing w:line="276" w:lineRule="auto" w:after="40" w:before="0"/>
-              <w:jc w:val="center"/>
-            </w:pPr>
-            <w:r>
-              <w:rPr>
-                <w:rFonts w:ascii="Times New Roman" w:hAnsi="Times New Roman" w:eastAsia="Times New Roman"/>
-                <w:b/>
-                <w:i/>
-                <w:sz w:val="26"/>
-              </w:rPr>
-              <w:t>nhiệm vụ</w:t>
+                <w:b w:val="0"/>
+                <w:i w:val="0"/>
+                <w:sz w:val="26"/>
+              </w:rPr>
+              <w:t>Bước 1: Chuyển giao nhiệm vụ học tập:</w:t>
+            </w:r>
+          </w:p>
+          <w:p>
+            <w:pPr>
+              <w:spacing w:line="276" w:lineRule="auto" w:after="40"/>
+              <w:jc w:val="left"/>
+            </w:pPr>
+            <w:r>
+              <w:rPr>
+                <w:rFonts w:ascii="Times New Roman" w:hAnsi="Times New Roman" w:eastAsia="Times New Roman"/>
+                <w:b w:val="0"/>
+                <w:i w:val="0"/>
+                <w:sz w:val="26"/>
+              </w:rPr>
+              <w:t>- GV giao bài tập thực hành bài Bài 1. Thông tin và dữ liệu trên máy tính.</w:t>
+            </w:r>
+          </w:p>
+          <w:p>
+            <w:pPr>
+              <w:spacing w:line="276" w:lineRule="auto" w:after="40"/>
+              <w:jc w:val="left"/>
+            </w:pPr>
+            <w:r>
+              <w:rPr>
+                <w:rFonts w:ascii="Times New Roman" w:hAnsi="Times New Roman" w:eastAsia="Times New Roman"/>
+                <w:b w:val="0"/>
+                <w:i w:val="0"/>
+                <w:sz w:val="26"/>
+              </w:rPr>
+              <w:t>Bước 2: Học sinh tiếp nhận nhiệm vụ học tập:</w:t>
+            </w:r>
+          </w:p>
+          <w:p>
+            <w:pPr>
+              <w:spacing w:line="276" w:lineRule="auto" w:after="40"/>
+              <w:jc w:val="left"/>
+            </w:pPr>
+            <w:r>
+              <w:rPr>
+                <w:rFonts w:ascii="Times New Roman" w:hAnsi="Times New Roman" w:eastAsia="Times New Roman"/>
+                <w:b w:val="0"/>
+                <w:i w:val="0"/>
+                <w:sz w:val="26"/>
+              </w:rPr>
+              <w:t>- HS mở phần mềm/tệp thực hành, bắt đầu làm bài.</w:t>
+            </w:r>
+          </w:p>
+          <w:p>
+            <w:pPr>
+              <w:spacing w:line="276" w:lineRule="auto" w:after="40"/>
+              <w:jc w:val="left"/>
+            </w:pPr>
+            <w:r>
+              <w:rPr>
+                <w:rFonts w:ascii="Times New Roman" w:hAnsi="Times New Roman" w:eastAsia="Times New Roman"/>
+                <w:b w:val="0"/>
+                <w:i w:val="0"/>
+                <w:sz w:val="26"/>
+              </w:rPr>
+              <w:t>- HS trao đổi nhóm đôi khi gặp khó khăn.</w:t>
+            </w:r>
+          </w:p>
+          <w:p>
+            <w:pPr>
+              <w:spacing w:line="276" w:lineRule="auto" w:after="40"/>
+              <w:jc w:val="left"/>
+            </w:pPr>
+            <w:r>
+              <w:rPr>
+                <w:rFonts w:ascii="Times New Roman" w:hAnsi="Times New Roman" w:eastAsia="Times New Roman"/>
+                <w:b w:val="0"/>
+                <w:i w:val="0"/>
+                <w:sz w:val="26"/>
+              </w:rPr>
+              <w:t>Bước 3: Báo cáo kết quả hoạt động:</w:t>
+            </w:r>
+          </w:p>
+          <w:p>
+            <w:pPr>
+              <w:spacing w:line="276" w:lineRule="auto" w:after="40"/>
+              <w:jc w:val="left"/>
+            </w:pPr>
+            <w:r>
+              <w:rPr>
+                <w:rFonts w:ascii="Times New Roman" w:hAnsi="Times New Roman" w:eastAsia="Times New Roman"/>
+                <w:b w:val="0"/>
+                <w:i w:val="0"/>
+                <w:sz w:val="26"/>
+              </w:rPr>
+              <w:t>- GV kiểm tra sản phẩm tại máy.</w:t>
+            </w:r>
+          </w:p>
+          <w:p>
+            <w:pPr>
+              <w:spacing w:line="276" w:lineRule="auto" w:after="40"/>
+              <w:jc w:val="left"/>
+            </w:pPr>
+            <w:r>
+              <w:rPr>
+                <w:rFonts w:ascii="Times New Roman" w:hAnsi="Times New Roman" w:eastAsia="Times New Roman"/>
+                <w:b w:val="0"/>
+                <w:i w:val="0"/>
+                <w:sz w:val="26"/>
+              </w:rPr>
+              <w:t>- HS đổi chéo kiểm tra bài của nhau.</w:t>
+            </w:r>
+          </w:p>
+          <w:p>
+            <w:pPr>
+              <w:spacing w:line="276" w:lineRule="auto" w:after="40"/>
+              <w:jc w:val="left"/>
+            </w:pPr>
+            <w:r>
+              <w:rPr>
+                <w:rFonts w:ascii="Times New Roman" w:hAnsi="Times New Roman" w:eastAsia="Times New Roman"/>
+                <w:b w:val="0"/>
+                <w:i w:val="0"/>
+                <w:sz w:val="26"/>
+              </w:rPr>
+              <w:t>Bước 4: Đánh giá kết quả thực hiện nhiệm vụ:</w:t>
+            </w:r>
+          </w:p>
+          <w:p>
+            <w:pPr>
+              <w:spacing w:line="276" w:lineRule="auto" w:after="40"/>
+              <w:jc w:val="left"/>
+            </w:pPr>
+            <w:r>
+              <w:rPr>
+                <w:rFonts w:ascii="Times New Roman" w:hAnsi="Times New Roman" w:eastAsia="Times New Roman"/>
+                <w:b w:val="0"/>
+                <w:i w:val="0"/>
+                <w:sz w:val="26"/>
+              </w:rPr>
+              <w:t>- GV nhận xét, đánh giá kết quả thực hành.</w:t>
+            </w:r>
+          </w:p>
+          <w:p>
+            <w:pPr>
+              <w:spacing w:line="276" w:lineRule="auto" w:after="40"/>
+              <w:jc w:val="left"/>
+            </w:pPr>
+            <w:r>
+              <w:rPr>
+                <w:rFonts w:ascii="Times New Roman" w:hAnsi="Times New Roman" w:eastAsia="Times New Roman"/>
+                <w:b w:val="0"/>
+                <w:i w:val="0"/>
+                <w:sz w:val="26"/>
+              </w:rPr>
+              <w:t>- Tuyên dương HS làm tốt.</w:t>
             </w:r>
           </w:p>
         </w:tc>
         <w:tc>
           <w:tcPr>
-            <w:tcW w:type="dxa" w:w="3628"/>
+            <w:tcW w:type="dxa" w:w="4875"/>
+            <w:tcMar>
+              <w:top w:w="80" w:type="dxa"/>
+              <w:bottom w:w="80" w:type="dxa"/>
+              <w:left w:w="120" w:type="dxa"/>
+              <w:right w:w="120" w:type="dxa"/>
+            </w:tcMar>
           </w:tcPr>
           <w:p>
             <w:pPr>
-              <w:spacing w:line="276" w:lineRule="auto" w:after="40" w:before="0"/>
+              <w:spacing w:line="276" w:lineRule="auto" w:after="40"/>
               <w:jc w:val="left"/>
             </w:pPr>
             <w:r/>
@@ -2053,313 +1859,22 @@
                 <w:i w:val="0"/>
                 <w:sz w:val="26"/>
               </w:rPr>
-              <w:t>GV giao bài tập thực hành luyện tập bài Bài 1. Thông tin và dữ liệu trên máy tính cho từng HS/nhóm đôi.</w:t>
-            </w:r>
-          </w:p>
-        </w:tc>
-        <w:tc>
-          <w:tcPr>
-            <w:tcW w:type="dxa" w:w="3628"/>
-          </w:tcPr>
-          <w:p>
-            <w:pPr>
-              <w:spacing w:line="276" w:lineRule="auto" w:after="40" w:before="0"/>
-              <w:jc w:val="left"/>
-            </w:pPr>
-            <w:r/>
-            <w:r>
-              <w:rPr>
-                <w:rFonts w:ascii="Times New Roman" w:hAnsi="Times New Roman" w:eastAsia="Times New Roman"/>
-                <w:b w:val="0"/>
-                <w:i w:val="0"/>
-                <w:sz w:val="26"/>
-              </w:rPr>
-              <w:t>HS mở phần mềm/tệp thực hành trên máy tính và bắt đầu làm bài.</w:t>
-            </w:r>
-          </w:p>
-        </w:tc>
-      </w:tr>
-      <w:tr>
-        <w:tc>
-          <w:tcPr>
-            <w:tcW w:type="dxa" w:w="1814"/>
-          </w:tcPr>
-          <w:p>
-            <w:pPr>
-              <w:spacing w:line="276" w:lineRule="auto" w:after="40" w:before="0"/>
-              <w:jc w:val="center"/>
-            </w:pPr>
-            <w:r/>
-            <w:r>
-              <w:rPr>
-                <w:rFonts w:ascii="Times New Roman" w:hAnsi="Times New Roman" w:eastAsia="Times New Roman"/>
-                <w:b/>
-                <w:i/>
-                <w:sz w:val="26"/>
-              </w:rPr>
-              <w:t>Bước 2:</w:t>
-            </w:r>
-          </w:p>
-          <w:p>
-            <w:pPr>
-              <w:spacing w:line="276" w:lineRule="auto" w:after="40" w:before="0"/>
-              <w:jc w:val="center"/>
-            </w:pPr>
-            <w:r>
-              <w:rPr>
-                <w:rFonts w:ascii="Times New Roman" w:hAnsi="Times New Roman" w:eastAsia="Times New Roman"/>
-                <w:b/>
-                <w:i/>
-                <w:sz w:val="26"/>
-              </w:rPr>
-              <w:t>Học sinh tiếp nhận</w:t>
-            </w:r>
-          </w:p>
-          <w:p>
-            <w:pPr>
-              <w:spacing w:line="276" w:lineRule="auto" w:after="40" w:before="0"/>
-              <w:jc w:val="center"/>
-            </w:pPr>
-            <w:r>
-              <w:rPr>
-                <w:rFonts w:ascii="Times New Roman" w:hAnsi="Times New Roman" w:eastAsia="Times New Roman"/>
-                <w:b/>
-                <w:i/>
-                <w:sz w:val="26"/>
-              </w:rPr>
-              <w:t>nhiệm vụ</w:t>
-            </w:r>
-          </w:p>
-        </w:tc>
-        <w:tc>
-          <w:tcPr>
-            <w:tcW w:type="dxa" w:w="3628"/>
-          </w:tcPr>
-          <w:p>
-            <w:pPr>
-              <w:spacing w:line="276" w:lineRule="auto" w:after="40" w:before="0"/>
-              <w:jc w:val="left"/>
-            </w:pPr>
-            <w:r/>
-            <w:r>
-              <w:rPr>
-                <w:rFonts w:ascii="Times New Roman" w:hAnsi="Times New Roman" w:eastAsia="Times New Roman"/>
-                <w:b w:val="0"/>
-                <w:i w:val="0"/>
-                <w:sz w:val="26"/>
-              </w:rPr>
-              <w:t>GV di chuyển quan sát, hỗ trợ kịp thời các HS còn lúng túng hoặc gặp sự cố kỹ thuật.</w:t>
-            </w:r>
-          </w:p>
-        </w:tc>
-        <w:tc>
-          <w:tcPr>
-            <w:tcW w:type="dxa" w:w="3628"/>
-          </w:tcPr>
-          <w:p>
-            <w:pPr>
-              <w:spacing w:line="276" w:lineRule="auto" w:after="40" w:before="0"/>
-              <w:jc w:val="left"/>
-            </w:pPr>
-            <w:r/>
-            <w:r>
-              <w:rPr>
-                <w:rFonts w:ascii="Times New Roman" w:hAnsi="Times New Roman" w:eastAsia="Times New Roman"/>
-                <w:b w:val="0"/>
-                <w:i w:val="0"/>
-                <w:sz w:val="26"/>
-              </w:rPr>
-              <w:t>HS tự giác thực hành cá nhân, chủ động trao đổi nhóm đôi khi gặp khó khăn.</w:t>
-            </w:r>
-          </w:p>
-        </w:tc>
-      </w:tr>
-      <w:tr>
-        <w:tc>
-          <w:tcPr>
-            <w:tcW w:type="dxa" w:w="1814"/>
-          </w:tcPr>
-          <w:p>
-            <w:pPr>
-              <w:spacing w:line="276" w:lineRule="auto" w:after="40" w:before="0"/>
-              <w:jc w:val="center"/>
-            </w:pPr>
-            <w:r/>
-            <w:r>
-              <w:rPr>
-                <w:rFonts w:ascii="Times New Roman" w:hAnsi="Times New Roman" w:eastAsia="Times New Roman"/>
-                <w:b/>
-                <w:i/>
-                <w:sz w:val="26"/>
-              </w:rPr>
-              <w:t>Bước 3:</w:t>
-            </w:r>
-          </w:p>
-          <w:p>
-            <w:pPr>
-              <w:spacing w:line="276" w:lineRule="auto" w:after="40" w:before="0"/>
-              <w:jc w:val="center"/>
-            </w:pPr>
-            <w:r>
-              <w:rPr>
-                <w:rFonts w:ascii="Times New Roman" w:hAnsi="Times New Roman" w:eastAsia="Times New Roman"/>
-                <w:b/>
-                <w:i/>
-                <w:sz w:val="26"/>
-              </w:rPr>
-              <w:t>Báo cáo kết quả</w:t>
-            </w:r>
-          </w:p>
-          <w:p>
-            <w:pPr>
-              <w:spacing w:line="276" w:lineRule="auto" w:after="40" w:before="0"/>
-              <w:jc w:val="center"/>
-            </w:pPr>
-            <w:r>
-              <w:rPr>
-                <w:rFonts w:ascii="Times New Roman" w:hAnsi="Times New Roman" w:eastAsia="Times New Roman"/>
-                <w:b/>
-                <w:i/>
-                <w:sz w:val="26"/>
-              </w:rPr>
-              <w:t>hoạt động</w:t>
-            </w:r>
-          </w:p>
-        </w:tc>
-        <w:tc>
-          <w:tcPr>
-            <w:tcW w:type="dxa" w:w="3628"/>
-          </w:tcPr>
-          <w:p>
-            <w:pPr>
-              <w:spacing w:line="276" w:lineRule="auto" w:after="40" w:before="0"/>
-              <w:jc w:val="left"/>
-            </w:pPr>
-            <w:r/>
-            <w:r>
-              <w:rPr>
-                <w:rFonts w:ascii="Times New Roman" w:hAnsi="Times New Roman" w:eastAsia="Times New Roman"/>
-                <w:b w:val="0"/>
-                <w:i w:val="0"/>
-                <w:sz w:val="26"/>
-              </w:rPr>
-              <w:t>GV kiểm tra nhanh sản phẩm tại máy của một số HS, cho HS đổi chéo kiểm tra bài của nhau.</w:t>
-            </w:r>
-          </w:p>
-        </w:tc>
-        <w:tc>
-          <w:tcPr>
-            <w:tcW w:type="dxa" w:w="3628"/>
-          </w:tcPr>
-          <w:p>
-            <w:pPr>
-              <w:spacing w:line="276" w:lineRule="auto" w:after="40" w:before="0"/>
-              <w:jc w:val="left"/>
-            </w:pPr>
-            <w:r/>
-            <w:r>
-              <w:rPr>
-                <w:rFonts w:ascii="Times New Roman" w:hAnsi="Times New Roman" w:eastAsia="Times New Roman"/>
-                <w:b w:val="0"/>
-                <w:i w:val="0"/>
-                <w:sz w:val="26"/>
-              </w:rPr>
-              <w:t>HS đối chiếu kết quả thực hành với bạn bên cạnh, báo cáo kết quả hoàn thành.</w:t>
-            </w:r>
-          </w:p>
-        </w:tc>
-      </w:tr>
-      <w:tr>
-        <w:tc>
-          <w:tcPr>
-            <w:tcW w:type="dxa" w:w="1814"/>
-          </w:tcPr>
-          <w:p>
-            <w:pPr>
-              <w:spacing w:line="276" w:lineRule="auto" w:after="40" w:before="0"/>
-              <w:jc w:val="center"/>
-            </w:pPr>
-            <w:r/>
-            <w:r>
-              <w:rPr>
-                <w:rFonts w:ascii="Times New Roman" w:hAnsi="Times New Roman" w:eastAsia="Times New Roman"/>
-                <w:b/>
-                <w:i/>
-                <w:sz w:val="26"/>
-              </w:rPr>
-              <w:t>Bước 4:</w:t>
-            </w:r>
-          </w:p>
-          <w:p>
-            <w:pPr>
-              <w:spacing w:line="276" w:lineRule="auto" w:after="40" w:before="0"/>
-              <w:jc w:val="center"/>
-            </w:pPr>
-            <w:r>
-              <w:rPr>
-                <w:rFonts w:ascii="Times New Roman" w:hAnsi="Times New Roman" w:eastAsia="Times New Roman"/>
-                <w:b/>
-                <w:i/>
-                <w:sz w:val="26"/>
-              </w:rPr>
-              <w:t>Đánh giá kết quả</w:t>
-            </w:r>
-          </w:p>
-          <w:p>
-            <w:pPr>
-              <w:spacing w:line="276" w:lineRule="auto" w:after="40" w:before="0"/>
-              <w:jc w:val="center"/>
-            </w:pPr>
-            <w:r>
-              <w:rPr>
-                <w:rFonts w:ascii="Times New Roman" w:hAnsi="Times New Roman" w:eastAsia="Times New Roman"/>
-                <w:b/>
-                <w:i/>
-                <w:sz w:val="26"/>
-              </w:rPr>
-              <w:t>thực hiện nhiệm vụ</w:t>
-            </w:r>
-          </w:p>
-        </w:tc>
-        <w:tc>
-          <w:tcPr>
-            <w:tcW w:type="dxa" w:w="3628"/>
-          </w:tcPr>
-          <w:p>
-            <w:pPr>
-              <w:spacing w:line="276" w:lineRule="auto" w:after="40" w:before="0"/>
-              <w:jc w:val="left"/>
-            </w:pPr>
-            <w:r/>
-            <w:r>
-              <w:rPr>
-                <w:rFonts w:ascii="Times New Roman" w:hAnsi="Times New Roman" w:eastAsia="Times New Roman"/>
-                <w:b w:val="0"/>
-                <w:i w:val="0"/>
-                <w:sz w:val="26"/>
-              </w:rPr>
-              <w:t>GV nhận xét, đánh giá kết quả thực hành của cả lớp, tuyên dương HS làm tốt.</w:t>
-            </w:r>
-          </w:p>
-        </w:tc>
-        <w:tc>
-          <w:tcPr>
-            <w:tcW w:type="dxa" w:w="3628"/>
-          </w:tcPr>
-          <w:p>
-            <w:pPr>
-              <w:spacing w:line="276" w:lineRule="auto" w:after="40" w:before="0"/>
-              <w:jc w:val="left"/>
-            </w:pPr>
-            <w:r/>
-            <w:r>
-              <w:rPr>
-                <w:rFonts w:ascii="Times New Roman" w:hAnsi="Times New Roman" w:eastAsia="Times New Roman"/>
-                <w:b w:val="0"/>
-                <w:i w:val="0"/>
-                <w:sz w:val="26"/>
-              </w:rPr>
-              <w:t>HS hoàn thiện sản phẩm, lưu tệp theo đúng hướng dẫn của GV.</w:t>
+              <w:t>Sản phẩm thực hành hoàn thành.</w:t>
+            </w:r>
+          </w:p>
+          <w:p>
+            <w:pPr>
+              <w:spacing w:line="276" w:lineRule="auto" w:after="40"/>
+              <w:jc w:val="left"/>
+            </w:pPr>
+            <w:r>
+              <w:rPr>
+                <w:rFonts w:ascii="Times New Roman" w:hAnsi="Times New Roman" w:eastAsia="Times New Roman"/>
+                <w:b w:val="0"/>
+                <w:i w:val="0"/>
+                <w:sz w:val="26"/>
+              </w:rPr>
+              <w:t>HS tự tin thao tác trên máy tính.</w:t>
             </w:r>
           </w:p>
         </w:tc>
@@ -2409,7 +1924,7 @@
           <w:i/>
           <w:sz w:val="26"/>
         </w:rPr>
-        <w:t>Vận dụng kiến thức, kỹ năng đã học vào giải quyết bài toán/tình huống thực tế cuộc sống.</w:t>
+        <w:t>Vận dụng kiến thức, kỹ năng đã học vào tình huống thực tế cuộc sống.</w:t>
       </w:r>
     </w:p>
     <w:p>
@@ -2434,7 +1949,7 @@
           <w:i/>
           <w:sz w:val="26"/>
         </w:rPr>
-        <w:t>GV đặt câu hỏi mở rộng, yêu cầu liên hệ thực tiễn hoặc giao bài tập về nhà sáng tạo.</w:t>
+        <w:t>GV đặt câu hỏi mở rộng, yêu cầu liên hệ thực tiễn.</w:t>
       </w:r>
     </w:p>
     <w:p>
@@ -2459,7 +1974,7 @@
           <w:i/>
           <w:sz w:val="26"/>
         </w:rPr>
-        <w:t>Ý kiến đề xuất giải pháp, sản phẩm ứng dụng sáng tạo và phòng máy được tắt an toàn.</w:t>
+        <w:t>Ý kiến đề xuất giải pháp, phòng máy được tắt an toàn.</w:t>
       </w:r>
     </w:p>
     <w:p>
@@ -2492,18 +2007,23 @@
         </w:tblBorders>
       </w:tblPr>
       <w:tblGrid>
-        <w:gridCol w:w="3198"/>
-        <w:gridCol w:w="3198"/>
-        <w:gridCol w:w="3198"/>
+        <w:gridCol w:w="4875"/>
+        <w:gridCol w:w="4875"/>
       </w:tblGrid>
       <w:tr>
         <w:tc>
           <w:tcPr>
-            <w:tcW w:type="dxa" w:w="1814"/>
+            <w:tcW w:type="dxa" w:w="5102"/>
+            <w:tcMar>
+              <w:top w:w="80" w:type="dxa"/>
+              <w:bottom w:w="80" w:type="dxa"/>
+              <w:left w:w="120" w:type="dxa"/>
+              <w:right w:w="120" w:type="dxa"/>
+            </w:tcMar>
           </w:tcPr>
           <w:p>
             <w:pPr>
-              <w:spacing w:line="276" w:lineRule="auto" w:after="40" w:before="0"/>
+              <w:spacing w:line="276" w:lineRule="auto" w:after="40"/>
               <w:jc w:val="center"/>
             </w:pPr>
             <w:r/>
@@ -2514,17 +2034,23 @@
                 <w:i w:val="0"/>
                 <w:sz w:val="26"/>
               </w:rPr>
-              <w:t>Bước</w:t>
+              <w:t>HOẠT ĐỘNG CỦA GV – HS</w:t>
             </w:r>
           </w:p>
         </w:tc>
         <w:tc>
           <w:tcPr>
-            <w:tcW w:type="dxa" w:w="3628"/>
+            <w:tcW w:type="dxa" w:w="3969"/>
+            <w:tcMar>
+              <w:top w:w="80" w:type="dxa"/>
+              <w:bottom w:w="80" w:type="dxa"/>
+              <w:left w:w="120" w:type="dxa"/>
+              <w:right w:w="120" w:type="dxa"/>
+            </w:tcMar>
           </w:tcPr>
           <w:p>
             <w:pPr>
-              <w:spacing w:line="276" w:lineRule="auto" w:after="40" w:before="0"/>
+              <w:spacing w:line="276" w:lineRule="auto" w:after="40"/>
               <w:jc w:val="center"/>
             </w:pPr>
             <w:r/>
@@ -2535,28 +2061,7 @@
                 <w:i w:val="0"/>
                 <w:sz w:val="26"/>
               </w:rPr>
-              <w:t>Hoạt động của GV</w:t>
-            </w:r>
-          </w:p>
-        </w:tc>
-        <w:tc>
-          <w:tcPr>
-            <w:tcW w:type="dxa" w:w="3628"/>
-          </w:tcPr>
-          <w:p>
-            <w:pPr>
-              <w:spacing w:line="276" w:lineRule="auto" w:after="40" w:before="0"/>
-              <w:jc w:val="center"/>
-            </w:pPr>
-            <w:r/>
-            <w:r>
-              <w:rPr>
-                <w:rFonts w:ascii="Times New Roman" w:hAnsi="Times New Roman" w:eastAsia="Times New Roman"/>
-                <w:b/>
-                <w:i w:val="0"/>
-                <w:sz w:val="26"/>
-              </w:rPr>
-              <w:t>Hoạt động của HS</w:t>
+              <w:t>KẾT QUẢ CẦN ĐẠT</w:t>
             </w:r>
           </w:p>
         </w:tc>
@@ -2564,62 +2069,164 @@
       <w:tr>
         <w:tc>
           <w:tcPr>
-            <w:tcW w:type="dxa" w:w="1814"/>
+            <w:tcW w:type="dxa" w:w="4875"/>
+            <w:tcMar>
+              <w:top w:w="80" w:type="dxa"/>
+              <w:bottom w:w="80" w:type="dxa"/>
+              <w:left w:w="120" w:type="dxa"/>
+              <w:right w:w="120" w:type="dxa"/>
+            </w:tcMar>
           </w:tcPr>
           <w:p>
             <w:pPr>
-              <w:spacing w:line="276" w:lineRule="auto" w:after="40" w:before="0"/>
-              <w:jc w:val="center"/>
+              <w:spacing w:line="276" w:lineRule="auto" w:after="40"/>
+              <w:jc w:val="left"/>
             </w:pPr>
             <w:r/>
             <w:r>
               <w:rPr>
                 <w:rFonts w:ascii="Times New Roman" w:hAnsi="Times New Roman" w:eastAsia="Times New Roman"/>
-                <w:b/>
-                <w:i/>
-                <w:sz w:val="26"/>
-              </w:rPr>
-              <w:t>Bước 1:</w:t>
-            </w:r>
-          </w:p>
-          <w:p>
-            <w:pPr>
-              <w:spacing w:line="276" w:lineRule="auto" w:after="40" w:before="0"/>
-              <w:jc w:val="center"/>
-            </w:pPr>
-            <w:r>
-              <w:rPr>
-                <w:rFonts w:ascii="Times New Roman" w:hAnsi="Times New Roman" w:eastAsia="Times New Roman"/>
-                <w:b/>
-                <w:i/>
-                <w:sz w:val="26"/>
-              </w:rPr>
-              <w:t>Chuyển giao</w:t>
-            </w:r>
-          </w:p>
-          <w:p>
-            <w:pPr>
-              <w:spacing w:line="276" w:lineRule="auto" w:after="40" w:before="0"/>
-              <w:jc w:val="center"/>
-            </w:pPr>
-            <w:r>
-              <w:rPr>
-                <w:rFonts w:ascii="Times New Roman" w:hAnsi="Times New Roman" w:eastAsia="Times New Roman"/>
-                <w:b/>
-                <w:i/>
-                <w:sz w:val="26"/>
-              </w:rPr>
-              <w:t>nhiệm vụ</w:t>
+                <w:b w:val="0"/>
+                <w:i w:val="0"/>
+                <w:sz w:val="26"/>
+              </w:rPr>
+              <w:t>Bước 1: Chuyển giao nhiệm vụ học tập:</w:t>
+            </w:r>
+          </w:p>
+          <w:p>
+            <w:pPr>
+              <w:spacing w:line="276" w:lineRule="auto" w:after="40"/>
+              <w:jc w:val="left"/>
+            </w:pPr>
+            <w:r>
+              <w:rPr>
+                <w:rFonts w:ascii="Times New Roman" w:hAnsi="Times New Roman" w:eastAsia="Times New Roman"/>
+                <w:b w:val="0"/>
+                <w:i w:val="0"/>
+                <w:sz w:val="26"/>
+              </w:rPr>
+              <w:t>- GV nêu câu hỏi: "Em có thể ứng dụng kiến thức bài Bài 1. Thông tin và dữ liệu như thế nào trong cuộc sống?"</w:t>
+            </w:r>
+          </w:p>
+          <w:p>
+            <w:pPr>
+              <w:spacing w:line="276" w:lineRule="auto" w:after="40"/>
+              <w:jc w:val="left"/>
+            </w:pPr>
+            <w:r>
+              <w:rPr>
+                <w:rFonts w:ascii="Times New Roman" w:hAnsi="Times New Roman" w:eastAsia="Times New Roman"/>
+                <w:b w:val="0"/>
+                <w:i w:val="0"/>
+                <w:sz w:val="26"/>
+              </w:rPr>
+              <w:t>Bước 2: Học sinh tiếp nhận nhiệm vụ học tập:</w:t>
+            </w:r>
+          </w:p>
+          <w:p>
+            <w:pPr>
+              <w:spacing w:line="276" w:lineRule="auto" w:after="40"/>
+              <w:jc w:val="left"/>
+            </w:pPr>
+            <w:r>
+              <w:rPr>
+                <w:rFonts w:ascii="Times New Roman" w:hAnsi="Times New Roman" w:eastAsia="Times New Roman"/>
+                <w:b w:val="0"/>
+                <w:i w:val="0"/>
+                <w:sz w:val="26"/>
+              </w:rPr>
+              <w:t>- HS suy nghĩ, thảo luận nhanh hoặc ghi chép ý tưởng.</w:t>
+            </w:r>
+          </w:p>
+          <w:p>
+            <w:pPr>
+              <w:spacing w:line="276" w:lineRule="auto" w:after="40"/>
+              <w:jc w:val="left"/>
+            </w:pPr>
+            <w:r>
+              <w:rPr>
+                <w:rFonts w:ascii="Times New Roman" w:hAnsi="Times New Roman" w:eastAsia="Times New Roman"/>
+                <w:b w:val="0"/>
+                <w:i w:val="0"/>
+                <w:sz w:val="26"/>
+              </w:rPr>
+              <w:t>Bước 3: Báo cáo kết quả hoạt động:</w:t>
+            </w:r>
+          </w:p>
+          <w:p>
+            <w:pPr>
+              <w:spacing w:line="276" w:lineRule="auto" w:after="40"/>
+              <w:jc w:val="left"/>
+            </w:pPr>
+            <w:r>
+              <w:rPr>
+                <w:rFonts w:ascii="Times New Roman" w:hAnsi="Times New Roman" w:eastAsia="Times New Roman"/>
+                <w:b w:val="0"/>
+                <w:i w:val="0"/>
+                <w:sz w:val="26"/>
+              </w:rPr>
+              <w:t>- 1-2 HS chia sẻ ý tưởng vận dụng trước lớp.</w:t>
+            </w:r>
+          </w:p>
+          <w:p>
+            <w:pPr>
+              <w:spacing w:line="276" w:lineRule="auto" w:after="40"/>
+              <w:jc w:val="left"/>
+            </w:pPr>
+            <w:r>
+              <w:rPr>
+                <w:rFonts w:ascii="Times New Roman" w:hAnsi="Times New Roman" w:eastAsia="Times New Roman"/>
+                <w:b w:val="0"/>
+                <w:i w:val="0"/>
+                <w:sz w:val="26"/>
+              </w:rPr>
+              <w:t>Bước 4: Giáo viên nhắc nhở nhiệm vụ về nhà:</w:t>
+            </w:r>
+          </w:p>
+          <w:p>
+            <w:pPr>
+              <w:spacing w:line="276" w:lineRule="auto" w:after="40"/>
+              <w:jc w:val="left"/>
+            </w:pPr>
+            <w:r>
+              <w:rPr>
+                <w:rFonts w:ascii="Times New Roman" w:hAnsi="Times New Roman" w:eastAsia="Times New Roman"/>
+                <w:b w:val="0"/>
+                <w:i w:val="0"/>
+                <w:sz w:val="26"/>
+              </w:rPr>
+              <w:t>- GV tổng kết tiết học, giao nhiệm vụ chuẩn bị bài sau.</w:t>
+            </w:r>
+          </w:p>
+          <w:p>
+            <w:pPr>
+              <w:spacing w:line="276" w:lineRule="auto" w:after="40"/>
+              <w:jc w:val="left"/>
+            </w:pPr>
+            <w:r>
+              <w:rPr>
+                <w:rFonts w:ascii="Times New Roman" w:hAnsi="Times New Roman" w:eastAsia="Times New Roman"/>
+                <w:b w:val="0"/>
+                <w:i w:val="0"/>
+                <w:sz w:val="26"/>
+              </w:rPr>
+              <w:t>- Hướng dẫn HS lưu bài, tắt máy và xếp gọn phòng học.</w:t>
             </w:r>
           </w:p>
         </w:tc>
         <w:tc>
           <w:tcPr>
-            <w:tcW w:type="dxa" w:w="3628"/>
+            <w:tcW w:type="dxa" w:w="4875"/>
+            <w:tcMar>
+              <w:top w:w="80" w:type="dxa"/>
+              <w:bottom w:w="80" w:type="dxa"/>
+              <w:left w:w="120" w:type="dxa"/>
+              <w:right w:w="120" w:type="dxa"/>
+            </w:tcMar>
           </w:tcPr>
           <w:p>
             <w:pPr>
-              <w:spacing w:line="276" w:lineRule="auto" w:after="40" w:before="0"/>
+              <w:spacing w:line="276" w:lineRule="auto" w:after="40"/>
               <w:jc w:val="left"/>
             </w:pPr>
             <w:r/>
@@ -2630,313 +2237,22 @@
                 <w:i w:val="0"/>
                 <w:sz w:val="26"/>
               </w:rPr>
-              <w:t>GV nêu câu hỏi vận dụng: "Em có thể ứng dụng kiến thức bài Bài 1. Thông tin và dữ liệu như thế nào trong học tập và cuộc sống?"</w:t>
-            </w:r>
-          </w:p>
-        </w:tc>
-        <w:tc>
-          <w:tcPr>
-            <w:tcW w:type="dxa" w:w="3628"/>
-          </w:tcPr>
-          <w:p>
-            <w:pPr>
-              <w:spacing w:line="276" w:lineRule="auto" w:after="40" w:before="0"/>
-              <w:jc w:val="left"/>
-            </w:pPr>
-            <w:r/>
-            <w:r>
-              <w:rPr>
-                <w:rFonts w:ascii="Times New Roman" w:hAnsi="Times New Roman" w:eastAsia="Times New Roman"/>
-                <w:b w:val="0"/>
-                <w:i w:val="0"/>
-                <w:sz w:val="26"/>
-              </w:rPr>
-              <w:t>HS tiếp nhận câu hỏi, suy nghĩ cá nhân liên hệ thực tế.</w:t>
-            </w:r>
-          </w:p>
-        </w:tc>
-      </w:tr>
-      <w:tr>
-        <w:tc>
-          <w:tcPr>
-            <w:tcW w:type="dxa" w:w="1814"/>
-          </w:tcPr>
-          <w:p>
-            <w:pPr>
-              <w:spacing w:line="276" w:lineRule="auto" w:after="40" w:before="0"/>
-              <w:jc w:val="center"/>
-            </w:pPr>
-            <w:r/>
-            <w:r>
-              <w:rPr>
-                <w:rFonts w:ascii="Times New Roman" w:hAnsi="Times New Roman" w:eastAsia="Times New Roman"/>
-                <w:b/>
-                <w:i/>
-                <w:sz w:val="26"/>
-              </w:rPr>
-              <w:t>Bước 2:</w:t>
-            </w:r>
-          </w:p>
-          <w:p>
-            <w:pPr>
-              <w:spacing w:line="276" w:lineRule="auto" w:after="40" w:before="0"/>
-              <w:jc w:val="center"/>
-            </w:pPr>
-            <w:r>
-              <w:rPr>
-                <w:rFonts w:ascii="Times New Roman" w:hAnsi="Times New Roman" w:eastAsia="Times New Roman"/>
-                <w:b/>
-                <w:i/>
-                <w:sz w:val="26"/>
-              </w:rPr>
-              <w:t>Học sinh tiếp nhận</w:t>
-            </w:r>
-          </w:p>
-          <w:p>
-            <w:pPr>
-              <w:spacing w:line="276" w:lineRule="auto" w:after="40" w:before="0"/>
-              <w:jc w:val="center"/>
-            </w:pPr>
-            <w:r>
-              <w:rPr>
-                <w:rFonts w:ascii="Times New Roman" w:hAnsi="Times New Roman" w:eastAsia="Times New Roman"/>
-                <w:b/>
-                <w:i/>
-                <w:sz w:val="26"/>
-              </w:rPr>
-              <w:t>nhiệm vụ</w:t>
-            </w:r>
-          </w:p>
-        </w:tc>
-        <w:tc>
-          <w:tcPr>
-            <w:tcW w:type="dxa" w:w="3628"/>
-          </w:tcPr>
-          <w:p>
-            <w:pPr>
-              <w:spacing w:line="276" w:lineRule="auto" w:after="40" w:before="0"/>
-              <w:jc w:val="left"/>
-            </w:pPr>
-            <w:r/>
-            <w:r>
-              <w:rPr>
-                <w:rFonts w:ascii="Times New Roman" w:hAnsi="Times New Roman" w:eastAsia="Times New Roman"/>
-                <w:b w:val="0"/>
-                <w:i w:val="0"/>
-                <w:sz w:val="26"/>
-              </w:rPr>
-              <w:t>GV dành 2-3 phút cho HS suy nghĩ, gợi ý các hướng liên hệ gần gũi.</w:t>
-            </w:r>
-          </w:p>
-        </w:tc>
-        <w:tc>
-          <w:tcPr>
-            <w:tcW w:type="dxa" w:w="3628"/>
-          </w:tcPr>
-          <w:p>
-            <w:pPr>
-              <w:spacing w:line="276" w:lineRule="auto" w:after="40" w:before="0"/>
-              <w:jc w:val="left"/>
-            </w:pPr>
-            <w:r/>
-            <w:r>
-              <w:rPr>
-                <w:rFonts w:ascii="Times New Roman" w:hAnsi="Times New Roman" w:eastAsia="Times New Roman"/>
-                <w:b w:val="0"/>
-                <w:i w:val="0"/>
-                <w:sz w:val="26"/>
-              </w:rPr>
-              <w:t>HS suy nghĩ, thảo luận nhanh hoặc ghi chép ý tưởng vào vở.</w:t>
-            </w:r>
-          </w:p>
-        </w:tc>
-      </w:tr>
-      <w:tr>
-        <w:tc>
-          <w:tcPr>
-            <w:tcW w:type="dxa" w:w="1814"/>
-          </w:tcPr>
-          <w:p>
-            <w:pPr>
-              <w:spacing w:line="276" w:lineRule="auto" w:after="40" w:before="0"/>
-              <w:jc w:val="center"/>
-            </w:pPr>
-            <w:r/>
-            <w:r>
-              <w:rPr>
-                <w:rFonts w:ascii="Times New Roman" w:hAnsi="Times New Roman" w:eastAsia="Times New Roman"/>
-                <w:b/>
-                <w:i/>
-                <w:sz w:val="26"/>
-              </w:rPr>
-              <w:t>Bước 3:</w:t>
-            </w:r>
-          </w:p>
-          <w:p>
-            <w:pPr>
-              <w:spacing w:line="276" w:lineRule="auto" w:after="40" w:before="0"/>
-              <w:jc w:val="center"/>
-            </w:pPr>
-            <w:r>
-              <w:rPr>
-                <w:rFonts w:ascii="Times New Roman" w:hAnsi="Times New Roman" w:eastAsia="Times New Roman"/>
-                <w:b/>
-                <w:i/>
-                <w:sz w:val="26"/>
-              </w:rPr>
-              <w:t>Báo cáo kết quả</w:t>
-            </w:r>
-          </w:p>
-          <w:p>
-            <w:pPr>
-              <w:spacing w:line="276" w:lineRule="auto" w:after="40" w:before="0"/>
-              <w:jc w:val="center"/>
-            </w:pPr>
-            <w:r>
-              <w:rPr>
-                <w:rFonts w:ascii="Times New Roman" w:hAnsi="Times New Roman" w:eastAsia="Times New Roman"/>
-                <w:b/>
-                <w:i/>
-                <w:sz w:val="26"/>
-              </w:rPr>
-              <w:t>hoạt động</w:t>
-            </w:r>
-          </w:p>
-        </w:tc>
-        <w:tc>
-          <w:tcPr>
-            <w:tcW w:type="dxa" w:w="3628"/>
-          </w:tcPr>
-          <w:p>
-            <w:pPr>
-              <w:spacing w:line="276" w:lineRule="auto" w:after="40" w:before="0"/>
-              <w:jc w:val="left"/>
-            </w:pPr>
-            <w:r/>
-            <w:r>
-              <w:rPr>
-                <w:rFonts w:ascii="Times New Roman" w:hAnsi="Times New Roman" w:eastAsia="Times New Roman"/>
-                <w:b w:val="0"/>
-                <w:i w:val="0"/>
-                <w:sz w:val="26"/>
-              </w:rPr>
-              <w:t>GV mời 1-2 HS chia sẻ ý tưởng vận dụng trước lớp.</w:t>
-            </w:r>
-          </w:p>
-        </w:tc>
-        <w:tc>
-          <w:tcPr>
-            <w:tcW w:type="dxa" w:w="3628"/>
-          </w:tcPr>
-          <w:p>
-            <w:pPr>
-              <w:spacing w:line="276" w:lineRule="auto" w:after="40" w:before="0"/>
-              <w:jc w:val="left"/>
-            </w:pPr>
-            <w:r/>
-            <w:r>
-              <w:rPr>
-                <w:rFonts w:ascii="Times New Roman" w:hAnsi="Times New Roman" w:eastAsia="Times New Roman"/>
-                <w:b w:val="0"/>
-                <w:i w:val="0"/>
-                <w:sz w:val="26"/>
-              </w:rPr>
-              <w:t>HS phát biểu ý tưởng sáng tạo; các bạn khác nhận xét, bổ sung.</w:t>
-            </w:r>
-          </w:p>
-        </w:tc>
-      </w:tr>
-      <w:tr>
-        <w:tc>
-          <w:tcPr>
-            <w:tcW w:type="dxa" w:w="1814"/>
-          </w:tcPr>
-          <w:p>
-            <w:pPr>
-              <w:spacing w:line="276" w:lineRule="auto" w:after="40" w:before="0"/>
-              <w:jc w:val="center"/>
-            </w:pPr>
-            <w:r/>
-            <w:r>
-              <w:rPr>
-                <w:rFonts w:ascii="Times New Roman" w:hAnsi="Times New Roman" w:eastAsia="Times New Roman"/>
-                <w:b/>
-                <w:i/>
-                <w:sz w:val="26"/>
-              </w:rPr>
-              <w:t>Bước 4:</w:t>
-            </w:r>
-          </w:p>
-          <w:p>
-            <w:pPr>
-              <w:spacing w:line="276" w:lineRule="auto" w:after="40" w:before="0"/>
-              <w:jc w:val="center"/>
-            </w:pPr>
-            <w:r>
-              <w:rPr>
-                <w:rFonts w:ascii="Times New Roman" w:hAnsi="Times New Roman" w:eastAsia="Times New Roman"/>
-                <w:b/>
-                <w:i/>
-                <w:sz w:val="26"/>
-              </w:rPr>
-              <w:t>Giáo viên nhắc nhở</w:t>
-            </w:r>
-          </w:p>
-          <w:p>
-            <w:pPr>
-              <w:spacing w:line="276" w:lineRule="auto" w:after="40" w:before="0"/>
-              <w:jc w:val="center"/>
-            </w:pPr>
-            <w:r>
-              <w:rPr>
-                <w:rFonts w:ascii="Times New Roman" w:hAnsi="Times New Roman" w:eastAsia="Times New Roman"/>
-                <w:b/>
-                <w:i/>
-                <w:sz w:val="26"/>
-              </w:rPr>
-              <w:t>nhiệm vụ về nhà</w:t>
-            </w:r>
-          </w:p>
-        </w:tc>
-        <w:tc>
-          <w:tcPr>
-            <w:tcW w:type="dxa" w:w="3628"/>
-          </w:tcPr>
-          <w:p>
-            <w:pPr>
-              <w:spacing w:line="276" w:lineRule="auto" w:after="40" w:before="0"/>
-              <w:jc w:val="left"/>
-            </w:pPr>
-            <w:r/>
-            <w:r>
-              <w:rPr>
-                <w:rFonts w:ascii="Times New Roman" w:hAnsi="Times New Roman" w:eastAsia="Times New Roman"/>
-                <w:b w:val="0"/>
-                <w:i w:val="0"/>
-                <w:sz w:val="26"/>
-              </w:rPr>
-              <w:t>GV tổng kết tiết học, giao nhiệm vụ chuẩn bị bài sau; hướng dẫn HS lưu bài, tắt máy và xếp gọn phòng học.</w:t>
-            </w:r>
-          </w:p>
-        </w:tc>
-        <w:tc>
-          <w:tcPr>
-            <w:tcW w:type="dxa" w:w="3628"/>
-          </w:tcPr>
-          <w:p>
-            <w:pPr>
-              <w:spacing w:line="276" w:lineRule="auto" w:after="40" w:before="0"/>
-              <w:jc w:val="left"/>
-            </w:pPr>
-            <w:r/>
-            <w:r>
-              <w:rPr>
-                <w:rFonts w:ascii="Times New Roman" w:hAnsi="Times New Roman" w:eastAsia="Times New Roman"/>
-                <w:b w:val="0"/>
-                <w:i w:val="0"/>
-                <w:sz w:val="26"/>
-              </w:rPr>
-              <w:t>HS ghi nhận nhiệm vụ về nhà, thực hiện Shutdown máy tính an toàn, xếp bàn ghế ngay ngắn.</w:t>
+              <w:t>HS liên hệ được kiến thức với thực tế.</w:t>
+            </w:r>
+          </w:p>
+          <w:p>
+            <w:pPr>
+              <w:spacing w:line="276" w:lineRule="auto" w:after="40"/>
+              <w:jc w:val="left"/>
+            </w:pPr>
+            <w:r>
+              <w:rPr>
+                <w:rFonts w:ascii="Times New Roman" w:hAnsi="Times New Roman" w:eastAsia="Times New Roman"/>
+                <w:b w:val="0"/>
+                <w:i w:val="0"/>
+                <w:sz w:val="26"/>
+              </w:rPr>
+              <w:t>Phòng máy thu dọn gọn gàng.</w:t>
             </w:r>
           </w:p>
         </w:tc>
@@ -2967,7 +2283,6 @@
     <w:p>
       <w:pPr>
         <w:spacing w:line="276" w:lineRule="auto" w:after="60" w:before="0"/>
-        <w:ind w:firstLine="0"/>
         <w:jc w:val="both"/>
       </w:pPr>
       <w:r>
@@ -2983,7 +2298,6 @@
     <w:p>
       <w:pPr>
         <w:spacing w:line="276" w:lineRule="auto" w:after="60" w:before="0"/>
-        <w:ind w:firstLine="0"/>
         <w:jc w:val="both"/>
       </w:pPr>
       <w:r>
@@ -3016,18 +2330,24 @@
         </w:tblBorders>
       </w:tblPr>
       <w:tblGrid>
-        <w:gridCol w:w="3198"/>
-        <w:gridCol w:w="3198"/>
-        <w:gridCol w:w="3198"/>
+        <w:gridCol w:w="3250"/>
+        <w:gridCol w:w="3250"/>
+        <w:gridCol w:w="3250"/>
       </w:tblGrid>
       <w:tr>
         <w:tc>
           <w:tcPr>
-            <w:tcW w:type="dxa" w:w="3198"/>
+            <w:tcW w:type="dxa" w:w="3250"/>
+            <w:tcMar>
+              <w:top w:w="80" w:type="dxa"/>
+              <w:bottom w:w="80" w:type="dxa"/>
+              <w:left w:w="120" w:type="dxa"/>
+              <w:right w:w="120" w:type="dxa"/>
+            </w:tcMar>
           </w:tcPr>
           <w:p>
             <w:pPr>
-              <w:spacing w:line="276" w:lineRule="auto" w:after="40" w:before="0"/>
+              <w:spacing w:line="276" w:lineRule="auto" w:after="40"/>
               <w:jc w:val="center"/>
             </w:pPr>
             <w:r/>
@@ -3044,11 +2364,17 @@
         </w:tc>
         <w:tc>
           <w:tcPr>
-            <w:tcW w:type="dxa" w:w="3198"/>
+            <w:tcW w:type="dxa" w:w="3250"/>
+            <w:tcMar>
+              <w:top w:w="80" w:type="dxa"/>
+              <w:bottom w:w="80" w:type="dxa"/>
+              <w:left w:w="120" w:type="dxa"/>
+              <w:right w:w="120" w:type="dxa"/>
+            </w:tcMar>
           </w:tcPr>
           <w:p>
             <w:pPr>
-              <w:spacing w:line="276" w:lineRule="auto" w:after="40" w:before="0"/>
+              <w:spacing w:line="276" w:lineRule="auto" w:after="40"/>
               <w:jc w:val="center"/>
             </w:pPr>
             <w:r/>
@@ -3065,11 +2391,17 @@
         </w:tc>
         <w:tc>
           <w:tcPr>
-            <w:tcW w:type="dxa" w:w="3198"/>
+            <w:tcW w:type="dxa" w:w="3250"/>
+            <w:tcMar>
+              <w:top w:w="80" w:type="dxa"/>
+              <w:bottom w:w="80" w:type="dxa"/>
+              <w:left w:w="120" w:type="dxa"/>
+              <w:right w:w="120" w:type="dxa"/>
+            </w:tcMar>
           </w:tcPr>
           <w:p>
             <w:pPr>
-              <w:spacing w:line="276" w:lineRule="auto" w:after="40" w:before="0"/>
+              <w:spacing w:line="276" w:lineRule="auto" w:after="40"/>
               <w:jc w:val="center"/>
             </w:pPr>
             <w:r/>
@@ -3088,11 +2420,17 @@
       <w:tr>
         <w:tc>
           <w:tcPr>
-            <w:tcW w:type="dxa" w:w="3198"/>
+            <w:tcW w:type="dxa" w:w="3250"/>
+            <w:tcMar>
+              <w:top w:w="80" w:type="dxa"/>
+              <w:bottom w:w="80" w:type="dxa"/>
+              <w:left w:w="120" w:type="dxa"/>
+              <w:right w:w="120" w:type="dxa"/>
+            </w:tcMar>
           </w:tcPr>
           <w:p>
             <w:pPr>
-              <w:spacing w:line="276" w:lineRule="auto" w:after="40" w:before="0"/>
+              <w:spacing w:line="276" w:lineRule="auto" w:after="40"/>
               <w:jc w:val="center"/>
             </w:pPr>
             <w:r/>
@@ -3109,11 +2447,17 @@
         </w:tc>
         <w:tc>
           <w:tcPr>
-            <w:tcW w:type="dxa" w:w="3198"/>
+            <w:tcW w:type="dxa" w:w="3250"/>
+            <w:tcMar>
+              <w:top w:w="80" w:type="dxa"/>
+              <w:bottom w:w="80" w:type="dxa"/>
+              <w:left w:w="120" w:type="dxa"/>
+              <w:right w:w="120" w:type="dxa"/>
+            </w:tcMar>
           </w:tcPr>
           <w:p>
             <w:pPr>
-              <w:spacing w:line="276" w:lineRule="auto" w:after="40" w:before="0"/>
+              <w:spacing w:line="276" w:lineRule="auto" w:after="40"/>
               <w:jc w:val="center"/>
             </w:pPr>
             <w:r/>
@@ -3130,11 +2474,17 @@
         </w:tc>
         <w:tc>
           <w:tcPr>
-            <w:tcW w:type="dxa" w:w="3198"/>
+            <w:tcW w:type="dxa" w:w="3250"/>
+            <w:tcMar>
+              <w:top w:w="80" w:type="dxa"/>
+              <w:bottom w:w="80" w:type="dxa"/>
+              <w:left w:w="120" w:type="dxa"/>
+              <w:right w:w="120" w:type="dxa"/>
+            </w:tcMar>
           </w:tcPr>
           <w:p>
             <w:pPr>
-              <w:spacing w:line="276" w:lineRule="auto" w:after="40" w:before="0"/>
+              <w:spacing w:line="276" w:lineRule="auto" w:after="40"/>
               <w:jc w:val="center"/>
             </w:pPr>
             <w:r/>
@@ -3153,35 +2503,159 @@
       <w:tr>
         <w:tc>
           <w:tcPr>
-            <w:tcW w:type="dxa" w:w="3198"/>
+            <w:tcW w:type="dxa" w:w="3250"/>
+            <w:tcMar>
+              <w:top w:w="80" w:type="dxa"/>
+              <w:bottom w:w="80" w:type="dxa"/>
+              <w:left w:w="120" w:type="dxa"/>
+              <w:right w:w="120" w:type="dxa"/>
+            </w:tcMar>
           </w:tcPr>
           <w:p>
-            <w:r>
-              <w:br/>
-              <w:br/>
-              <w:br/>
+            <w:pPr>
+              <w:spacing w:line="276" w:lineRule="auto" w:after="40"/>
+              <w:jc w:val="center"/>
+            </w:pPr>
+            <w:r/>
+            <w:r>
+              <w:rPr>
+                <w:rFonts w:ascii="Times New Roman" w:hAnsi="Times New Roman" w:eastAsia="Times New Roman"/>
+                <w:b w:val="0"/>
+                <w:i w:val="0"/>
+                <w:sz w:val="26"/>
+              </w:rPr>
+            </w:r>
+          </w:p>
+          <w:p>
+            <w:pPr>
+              <w:spacing w:line="276" w:lineRule="auto" w:after="40"/>
+              <w:jc w:val="center"/>
+            </w:pPr>
+            <w:r>
+              <w:rPr>
+                <w:rFonts w:ascii="Times New Roman" w:hAnsi="Times New Roman" w:eastAsia="Times New Roman"/>
+                <w:b w:val="0"/>
+                <w:i w:val="0"/>
+                <w:sz w:val="26"/>
+              </w:rPr>
+            </w:r>
+          </w:p>
+          <w:p>
+            <w:pPr>
+              <w:spacing w:line="276" w:lineRule="auto" w:after="40"/>
+              <w:jc w:val="center"/>
+            </w:pPr>
+            <w:r>
+              <w:rPr>
+                <w:rFonts w:ascii="Times New Roman" w:hAnsi="Times New Roman" w:eastAsia="Times New Roman"/>
+                <w:b w:val="0"/>
+                <w:i w:val="0"/>
+                <w:sz w:val="26"/>
+              </w:rPr>
+            </w:r>
+          </w:p>
+          <w:p>
+            <w:pPr>
+              <w:spacing w:line="276" w:lineRule="auto" w:after="40"/>
+              <w:jc w:val="center"/>
+            </w:pPr>
+            <w:r>
+              <w:rPr>
+                <w:rFonts w:ascii="Times New Roman" w:hAnsi="Times New Roman" w:eastAsia="Times New Roman"/>
+                <w:b w:val="0"/>
+                <w:i w:val="0"/>
+                <w:sz w:val="26"/>
+              </w:rPr>
             </w:r>
           </w:p>
         </w:tc>
         <w:tc>
           <w:tcPr>
-            <w:tcW w:type="dxa" w:w="3198"/>
+            <w:tcW w:type="dxa" w:w="3250"/>
+            <w:tcMar>
+              <w:top w:w="80" w:type="dxa"/>
+              <w:bottom w:w="80" w:type="dxa"/>
+              <w:left w:w="120" w:type="dxa"/>
+              <w:right w:w="120" w:type="dxa"/>
+            </w:tcMar>
           </w:tcPr>
           <w:p>
-            <w:r>
-              <w:br/>
-              <w:br/>
-              <w:br/>
+            <w:pPr>
+              <w:spacing w:line="276" w:lineRule="auto" w:after="40"/>
+              <w:jc w:val="center"/>
+            </w:pPr>
+            <w:r/>
+            <w:r>
+              <w:rPr>
+                <w:rFonts w:ascii="Times New Roman" w:hAnsi="Times New Roman" w:eastAsia="Times New Roman"/>
+                <w:b w:val="0"/>
+                <w:i w:val="0"/>
+                <w:sz w:val="26"/>
+              </w:rPr>
+            </w:r>
+          </w:p>
+          <w:p>
+            <w:pPr>
+              <w:spacing w:line="276" w:lineRule="auto" w:after="40"/>
+              <w:jc w:val="center"/>
+            </w:pPr>
+            <w:r>
+              <w:rPr>
+                <w:rFonts w:ascii="Times New Roman" w:hAnsi="Times New Roman" w:eastAsia="Times New Roman"/>
+                <w:b w:val="0"/>
+                <w:i w:val="0"/>
+                <w:sz w:val="26"/>
+              </w:rPr>
+            </w:r>
+          </w:p>
+          <w:p>
+            <w:pPr>
+              <w:spacing w:line="276" w:lineRule="auto" w:after="40"/>
+              <w:jc w:val="center"/>
+            </w:pPr>
+            <w:r>
+              <w:rPr>
+                <w:rFonts w:ascii="Times New Roman" w:hAnsi="Times New Roman" w:eastAsia="Times New Roman"/>
+                <w:b w:val="0"/>
+                <w:i w:val="0"/>
+                <w:sz w:val="26"/>
+              </w:rPr>
+            </w:r>
+          </w:p>
+          <w:p>
+            <w:pPr>
+              <w:spacing w:line="276" w:lineRule="auto" w:after="40"/>
+              <w:jc w:val="center"/>
+            </w:pPr>
+            <w:r>
+              <w:rPr>
+                <w:rFonts w:ascii="Times New Roman" w:hAnsi="Times New Roman" w:eastAsia="Times New Roman"/>
+                <w:b w:val="0"/>
+                <w:i w:val="0"/>
+                <w:sz w:val="26"/>
+              </w:rPr>
             </w:r>
           </w:p>
         </w:tc>
         <w:tc>
           <w:tcPr>
-            <w:tcW w:type="dxa" w:w="3198"/>
+            <w:tcW w:type="dxa" w:w="3250"/>
+            <w:tcMar>
+              <w:top w:w="80" w:type="dxa"/>
+              <w:bottom w:w="80" w:type="dxa"/>
+              <w:left w:w="120" w:type="dxa"/>
+              <w:right w:w="120" w:type="dxa"/>
+            </w:tcMar>
+            <w:tcMar>
+              <w:top w:w="80" w:type="dxa"/>
+              <w:bottom w:w="80" w:type="dxa"/>
+              <w:left w:w="120" w:type="dxa"/>
+              <w:right w:w="120" w:type="dxa"/>
+            </w:tcMar>
           </w:tcPr>
           <w:p>
             <w:pPr>
-              <w:spacing w:line="276" w:lineRule="auto" w:after="40" w:before="0"/>
+              <w:spacing w:line="276" w:lineRule="auto" w:after="40"/>
               <w:jc w:val="center"/>
             </w:pPr>
             <w:r/>
@@ -3196,7 +2670,7 @@
           </w:p>
           <w:p>
             <w:pPr>
-              <w:spacing w:line="276" w:lineRule="auto" w:after="40" w:before="0"/>
+              <w:spacing w:line="276" w:lineRule="auto" w:after="40"/>
               <w:jc w:val="center"/>
             </w:pPr>
             <w:r>
@@ -3210,7 +2684,7 @@
           </w:p>
           <w:p>
             <w:pPr>
-              <w:spacing w:line="276" w:lineRule="auto" w:after="40" w:before="0"/>
+              <w:spacing w:line="276" w:lineRule="auto" w:after="40"/>
               <w:jc w:val="center"/>
             </w:pPr>
             <w:r>
@@ -3224,7 +2698,7 @@
           </w:p>
           <w:p>
             <w:pPr>
-              <w:spacing w:line="276" w:lineRule="auto" w:after="40" w:before="0"/>
+              <w:spacing w:line="276" w:lineRule="auto" w:after="40"/>
               <w:jc w:val="center"/>
             </w:pPr>
             <w:r>
@@ -3248,7 +2722,7 @@
       <w:headerReference w:type="first" r:id="rId12"/>
       <w:footerReference w:type="first" r:id="rId13"/>
       <w:pgSz w:w="11910" w:h="16840"/>
-      <w:pgMar w:top="630" w:right="1137" w:bottom="280" w:left="1180" w:header="283" w:footer="0" w:gutter="0"/>
+      <w:pgMar w:top="720" w:right="720" w:bottom="720" w:left="1440" w:header="283" w:footer="0" w:gutter="0"/>
       <w:pgNumType w:start="1"/>
       <w:cols w:space="720"/>
     </w:sectPr>

</xml_diff>